<commit_message>
changes for week of May 26th
</commit_message>
<xml_diff>
--- a/writing/2025-04-07_Lucore_GMtemp-ajm.docx
+++ b/writing/2025-04-07_Lucore_GMtemp-ajm.docx
@@ -2753,6 +2753,7 @@
       </w:r>
       <w:commentRangeStart w:id="25"/>
       <w:commentRangeStart w:id="26"/>
+      <w:commentRangeStart w:id="27"/>
       <w:r>
         <w:t xml:space="preserve">A pseudo count </w:t>
       </w:r>
@@ -2769,6 +2770,13 @@
           <w:rStyle w:val="CommentReference"/>
         </w:rPr>
         <w:commentReference w:id="26"/>
+      </w:r>
+      <w:commentRangeEnd w:id="27"/>
+      <w:r>
+        <w:rPr>
+          <w:rStyle w:val="CommentReference"/>
+        </w:rPr>
+        <w:commentReference w:id="27"/>
       </w:r>
       <w:r>
         <w:t xml:space="preserve">was added to all zeros before the </w:t>
@@ -2864,8 +2872,8 @@
       <w:r>
         <w:t xml:space="preserve">. </w:t>
       </w:r>
-      <w:commentRangeStart w:id="27"/>
       <w:commentRangeStart w:id="28"/>
+      <w:commentRangeStart w:id="29"/>
       <w:r>
         <w:t xml:space="preserve">Aitchison distances account for the compositional nature of microbiome data by using log-ratio transformed counts, making them less sensitive to differences in sequencing depth and the removal of rare taxa </w:t>
       </w:r>
@@ -2898,19 +2906,19 @@
       <w:r>
         <w:t xml:space="preserve">, Jensen-Shannon divergence) </w:t>
       </w:r>
-      <w:commentRangeEnd w:id="27"/>
+      <w:commentRangeEnd w:id="28"/>
       <w:r>
         <w:rPr>
           <w:rStyle w:val="CommentReference"/>
         </w:rPr>
-        <w:commentReference w:id="27"/>
-      </w:r>
-      <w:commentRangeEnd w:id="28"/>
+        <w:commentReference w:id="28"/>
+      </w:r>
+      <w:commentRangeEnd w:id="29"/>
       <w:r>
         <w:rPr>
           <w:rStyle w:val="CommentReference"/>
         </w:rPr>
-        <w:commentReference w:id="28"/>
+        <w:commentReference w:id="29"/>
       </w:r>
       <w:r>
         <w:t xml:space="preserve">that use raw counts or proportions </w:t>
@@ -2934,10 +2942,18 @@
         <w:fldChar w:fldCharType="end"/>
       </w:r>
       <w:r>
-        <w:t xml:space="preserve">. A Principle Components Analysis was performed on the Aitchison distance matrix and the scores for the first four principal components (PC1–PC4) were extracted to capture major axes of variation in community composition. </w:t>
-      </w:r>
-      <w:commentRangeStart w:id="29"/>
+        <w:t xml:space="preserve">. A </w:t>
+      </w:r>
+      <w:proofErr w:type="gramStart"/>
+      <w:r>
+        <w:t>Principle</w:t>
+      </w:r>
+      <w:proofErr w:type="gramEnd"/>
+      <w:r>
+        <w:t xml:space="preserve"> Components Analysis was performed on the Aitchison distance matrix and the scores for the first four principal components (PC1–PC4) were extracted to capture major axes of variation in community composition. </w:t>
+      </w:r>
       <w:commentRangeStart w:id="30"/>
+      <w:commentRangeStart w:id="31"/>
       <w:r>
         <w:t>Components PC1-PC4 were selected because they explained the greatest percent variance relative to the other components (</w:t>
       </w:r>
@@ -2953,19 +2969,19 @@
       <w:r>
         <w:t>).</w:t>
       </w:r>
-      <w:commentRangeEnd w:id="29"/>
+      <w:commentRangeEnd w:id="30"/>
       <w:r>
         <w:rPr>
           <w:rStyle w:val="CommentReference"/>
         </w:rPr>
-        <w:commentReference w:id="29"/>
-      </w:r>
-      <w:commentRangeEnd w:id="30"/>
+        <w:commentReference w:id="30"/>
+      </w:r>
+      <w:commentRangeEnd w:id="31"/>
       <w:r>
         <w:rPr>
           <w:rStyle w:val="CommentReference"/>
         </w:rPr>
-        <w:commentReference w:id="30"/>
+        <w:commentReference w:id="31"/>
       </w:r>
     </w:p>
     <w:p>
@@ -3044,7 +3060,15 @@
       </w:r>
       <w:proofErr w:type="spellEnd"/>
       <w:r>
-        <w:t>, included all of the same predictors with an additional predictor for temperature. Both models included a random intercept for individual to control for repeated sampling and an offset for the log-transformed number of reads to control for differences in sequencing depth between samples. Fruit consumption was included as a predictor because it increased with rising temperatures (</w:t>
+        <w:t xml:space="preserve">, included </w:t>
+      </w:r>
+      <w:proofErr w:type="gramStart"/>
+      <w:r>
+        <w:t>all of</w:t>
+      </w:r>
+      <w:proofErr w:type="gramEnd"/>
+      <w:r>
+        <w:t xml:space="preserve"> the same predictors with an additional predictor for temperature. Both models included a random intercept for individual to control for repeated sampling and an offset for the log-transformed number of reads to control for differences in sequencing depth between samples. Fruit consumption was included as a predictor because it increased with rising temperatures (</w:t>
       </w:r>
       <w:r>
         <w:t>Fig 2S</w:t>
@@ -3107,81 +3131,134 @@
       <w:r>
         <w:t>. In contrast, null hypothesis testing relies on a null hypothesis that is never directly observed and i</w:t>
       </w:r>
-      <w:commentRangeStart w:id="31"/>
       <w:commentRangeStart w:id="32"/>
-      <w:r>
-        <w:t xml:space="preserve">s inappropriate for drawing biologically meaningful conclusions </w:t>
-      </w:r>
-      <w:r>
-        <w:fldChar w:fldCharType="begin"/>
-      </w:r>
-      <w:r>
-        <w:instrText xml:space="preserve"> ADDIN ZOTERO_ITEM CSL_CITATION {"citationID":"Ze48qZo2","properties":{"formattedCitation":"(Burnham et al., 2011; Yoccoz, 1991)","plainCitation":"(Burnham et al., 2011; Yoccoz, 1991)","noteIndex":0},"citationItems":[{"id":1043,"uris":["http://zotero.org/users/13901503/items/MUQFF6P5"],"itemData":{"id":1043,"type":"article-journal","abstract":"We briefly outline the information-theoretic (I-T) approaches to valid inference including a review of some simple methods for making formal inference from all the hypotheses in the model set (multimodel inference). The I-T approaches can replace the usual t tests and ANOVA tables that are so inferentially limited, but still commonly used. The I-T methods are easy to compute and understand and provide formal measures of the strength of evidence for both the null and alternative hypotheses, given the data. We give an example to highlight the importance of deriving alternative hypotheses and representing these as probability models. Fifteen technical issues are addressed to clarify various points that have appeared incorrectly in the recent literature. We offer several remarks regarding the future of empirical science and data analysis under an I-T framework.","container-title":"Behavioral Ecology and Sociobiology","DOI":"10.1007/s00265-010-1029-6","ISSN":"1432-0762","issue":"1","journalAbbreviation":"Behav Ecol Sociobiol","language":"en","page":"23-35","source":"Springer Link","title":"AIC model selection and multimodel inference in behavioral ecology: some background, observations, and comparisons","title-short":"AIC model selection and multimodel inference in behavioral ecology","volume":"65","author":[{"family":"Burnham","given":"Kenneth P."},{"family":"Anderson","given":"David R."},{"family":"Huyvaert","given":"Kathryn P."}],"issued":{"date-parts":[["2011",1,1]]}}},{"id":1698,"uris":["http://zotero.org/users/13901503/items/BN6B54VG"],"itemData":{"id":1698,"type":"article-journal","container-title":"Bulletin of the Ecological Society of America","ISSN":"0012-9623","issue":"2","note":"publisher: [Wiley, Ecological Society of America]","page":"106-111","source":"JSTOR","title":"Use, Overuse, and Misuse of Significance Tests in Evolutionary Biology and Ecology","volume":"72","author":[{"family":"Yoccoz","given":"Nigel G."}],"issued":{"date-parts":[["1991"]]}}}],"schema":"https://github.com/citation-style-language/schema/raw/master/csl-citation.json"} </w:instrText>
-      </w:r>
-      <w:r>
-        <w:fldChar w:fldCharType="separate"/>
-      </w:r>
-      <w:r>
-        <w:rPr>
-          <w:noProof/>
-        </w:rPr>
-        <w:t>(Burnham et al., 2011; Yoccoz, 1991)</w:t>
-      </w:r>
-      <w:r>
-        <w:fldChar w:fldCharType="end"/>
-      </w:r>
-      <w:r>
-        <w:t xml:space="preserve">. </w:t>
-      </w:r>
-      <w:commentRangeEnd w:id="31"/>
-      <w:r>
-        <w:rPr>
-          <w:rStyle w:val="CommentReference"/>
-        </w:rPr>
-        <w:commentReference w:id="31"/>
-      </w:r>
-      <w:commentRangeEnd w:id="32"/>
-      <w:r>
-        <w:rPr>
-          <w:rStyle w:val="CommentReference"/>
-        </w:rPr>
-        <w:commentReference w:id="32"/>
-      </w:r>
-    </w:p>
-    <w:p/>
-    <w:p>
-      <w:pPr>
-        <w:rPr>
-          <w:u w:val="single"/>
-        </w:rPr>
-      </w:pPr>
-      <w:r>
-        <w:rPr>
-          <w:u w:val="single"/>
-        </w:rPr>
-        <w:t>Temperature d</w:t>
-      </w:r>
-      <w:r>
-        <w:rPr>
-          <w:u w:val="single"/>
-        </w:rPr>
-        <w:t xml:space="preserve">ifferential abundance </w:t>
-      </w:r>
-      <w:r>
-        <w:rPr>
-          <w:u w:val="single"/>
-        </w:rPr>
-        <w:t>analysis</w:t>
-      </w:r>
-    </w:p>
-    <w:p>
-      <w:pPr>
-        <w:ind w:firstLine="720"/>
-      </w:pPr>
       <w:commentRangeStart w:id="33"/>
       <w:commentRangeStart w:id="34"/>
-      <w:r>
-        <w:t>Similar to our community</w:t>
+      <w:commentRangeStart w:id="35"/>
+      <w:r>
+        <w:t>s</w:t>
+      </w:r>
+      <w:ins w:id="36" w:author="Lucore, Jordan" w:date="2025-05-16T12:47:00Z" w16du:dateUtc="2025-05-16T16:47:00Z">
+        <w:r>
+          <w:t xml:space="preserve"> therefore</w:t>
+        </w:r>
+      </w:ins>
+      <w:r>
+        <w:t xml:space="preserve"> </w:t>
+      </w:r>
+      <w:ins w:id="37" w:author="Lucore, Jordan" w:date="2025-05-16T12:48:00Z" w16du:dateUtc="2025-05-16T16:48:00Z">
+        <w:r>
+          <w:t xml:space="preserve">poorly suited </w:t>
+        </w:r>
+      </w:ins>
+      <w:del w:id="38" w:author="Lucore, Jordan" w:date="2025-05-16T12:48:00Z" w16du:dateUtc="2025-05-16T16:48:00Z">
+        <w:r>
+          <w:delText>inappropriate</w:delText>
+        </w:r>
+      </w:del>
+      <w:r>
+        <w:t xml:space="preserve"> for drawing biologically meaningful conclusions </w:t>
+      </w:r>
+      <w:r>
+        <w:fldChar w:fldCharType="begin"/>
+      </w:r>
+      <w:r>
+        <w:instrText xml:space="preserve"> ADDIN ZOTERO_ITEM CSL_CITATION {"citationID":"Ze48qZo2","properties":{"formattedCitation":"(Burnham et al., 2011; Yoccoz, 1991)","plainCitation":"(Burnham et al., 2011; Yoccoz, 1991)","noteIndex":0},"citationItems":[{"id":1043,"uris":["http://zotero.org/users/13901503/items/MUQFF6P5"],"itemData":{"id":1043,"type":"article-journal","abstract":"We briefly outline the information-theoretic (I-T) approaches to valid inference including a review of some simple methods for making formal inference from all the hypotheses in the model set (multimodel inference). The I-T approaches can replace the usual t tests and ANOVA tables that are so inferentially limited, but still commonly used. The I-T methods are easy to compute and understand and provide formal measures of the strength of evidence for both the null and alternative hypotheses, given the data. We give an example to highlight the importance of deriving alternative hypotheses and representing these as probability models. Fifteen technical issues are addressed to clarify various points that have appeared incorrectly in the recent literature. We offer several remarks regarding the future of empirical science and data analysis under an I-T framework.","container-title":"Behavioral Ecology and Sociobiology","DOI":"10.1007/s00265-010-1029-6","ISSN":"1432-0762","issue":"1","journalAbbreviation":"Behav Ecol Sociobiol","language":"en","page":"23-35","source":"Springer Link","title":"AIC model selection and multimodel inference in behavioral ecology: some background, observations, and comparisons","title-short":"AIC model selection and multimodel inference in behavioral ecology","volume":"65","author":[{"family":"Burnham","given":"Kenneth P."},{"family":"Anderson","given":"David R."},{"family":"Huyvaert","given":"Kathryn P."}],"issued":{"date-parts":[["2011",1,1]]}}},{"id":1698,"uris":["http://zotero.org/users/13901503/items/BN6B54VG"],"itemData":{"id":1698,"type":"article-journal","container-title":"Bulletin of the Ecological Society of America","ISSN":"0012-9623","issue":"2","note":"publisher: [Wiley, Ecological Society of America]","page":"106-111","source":"JSTOR","title":"Use, Overuse, and Misuse of Significance Tests in Evolutionary Biology and Ecology","volume":"72","author":[{"family":"Yoccoz","given":"Nigel G."}],"issued":{"date-parts":[["1991"]]}}}],"schema":"https://github.com/citation-style-language/schema/raw/master/csl-citation.json"} </w:instrText>
+      </w:r>
+      <w:r>
+        <w:fldChar w:fldCharType="separate"/>
+      </w:r>
+      <w:r>
+        <w:rPr>
+          <w:noProof/>
+        </w:rPr>
+        <w:t>(Burnham et al., 2011; Yoccoz, 1991)</w:t>
+      </w:r>
+      <w:r>
+        <w:fldChar w:fldCharType="end"/>
+      </w:r>
+      <w:r>
+        <w:t xml:space="preserve">. </w:t>
+      </w:r>
+      <w:commentRangeEnd w:id="32"/>
+      <w:r>
+        <w:rPr>
+          <w:rStyle w:val="CommentReference"/>
+        </w:rPr>
+        <w:commentReference w:id="32"/>
+      </w:r>
+      <w:commentRangeEnd w:id="33"/>
+      <w:r>
+        <w:rPr>
+          <w:rStyle w:val="CommentReference"/>
+        </w:rPr>
+        <w:commentReference w:id="33"/>
+      </w:r>
+      <w:commentRangeEnd w:id="34"/>
+      <w:r>
+        <w:rPr>
+          <w:rStyle w:val="CommentReference"/>
+        </w:rPr>
+        <w:commentReference w:id="34"/>
+      </w:r>
+      <w:commentRangeEnd w:id="35"/>
+      <w:r>
+        <w:rPr>
+          <w:rStyle w:val="CommentReference"/>
+        </w:rPr>
+        <w:commentReference w:id="35"/>
+      </w:r>
+      <w:ins w:id="39" w:author="Lucore, Jordan" w:date="2025-05-16T12:51:00Z" w16du:dateUtc="2025-05-16T16:51:00Z">
+        <w:r>
+          <w:t xml:space="preserve">Say something like </w:t>
+        </w:r>
+      </w:ins>
+      <w:ins w:id="40" w:author="Lucore, Jordan" w:date="2025-05-16T12:52:00Z" w16du:dateUtc="2025-05-16T16:52:00Z">
+        <w:r>
+          <w:t xml:space="preserve">“more informative” </w:t>
+        </w:r>
+      </w:ins>
+    </w:p>
+    <w:p/>
+    <w:p>
+      <w:pPr>
+        <w:rPr>
+          <w:u w:val="single"/>
+        </w:rPr>
+      </w:pPr>
+      <w:r>
+        <w:rPr>
+          <w:u w:val="single"/>
+        </w:rPr>
+        <w:t>Temperature d</w:t>
+      </w:r>
+      <w:r>
+        <w:rPr>
+          <w:u w:val="single"/>
+        </w:rPr>
+        <w:t xml:space="preserve">ifferential abundance </w:t>
+      </w:r>
+      <w:r>
+        <w:rPr>
+          <w:u w:val="single"/>
+        </w:rPr>
+        <w:t>analysis</w:t>
+      </w:r>
+    </w:p>
+    <w:p>
+      <w:pPr>
+        <w:ind w:firstLine="720"/>
+      </w:pPr>
+      <w:commentRangeStart w:id="41"/>
+      <w:commentRangeStart w:id="42"/>
+      <w:commentRangeStart w:id="43"/>
+      <w:proofErr w:type="gramStart"/>
+      <w:r>
+        <w:t>Similar to</w:t>
+      </w:r>
+      <w:proofErr w:type="gramEnd"/>
+      <w:r>
+        <w:t xml:space="preserve"> our community</w:t>
       </w:r>
       <w:r>
         <w:t>-level</w:t>
@@ -3189,19 +3266,26 @@
       <w:r>
         <w:t xml:space="preserve"> analysis, we used a comparative modeling approach to evaluate which individual taxa abundances are related to temperature</w:t>
       </w:r>
-      <w:commentRangeEnd w:id="33"/>
+      <w:commentRangeEnd w:id="41"/>
       <w:r>
         <w:rPr>
           <w:rStyle w:val="CommentReference"/>
         </w:rPr>
-        <w:commentReference w:id="33"/>
-      </w:r>
-      <w:commentRangeEnd w:id="34"/>
+        <w:commentReference w:id="41"/>
+      </w:r>
+      <w:commentRangeEnd w:id="42"/>
       <w:r>
         <w:rPr>
           <w:rStyle w:val="CommentReference"/>
         </w:rPr>
-        <w:commentReference w:id="34"/>
+        <w:commentReference w:id="42"/>
+      </w:r>
+      <w:commentRangeEnd w:id="43"/>
+      <w:r>
+        <w:rPr>
+          <w:rStyle w:val="CommentReference"/>
+        </w:rPr>
+        <w:commentReference w:id="43"/>
       </w:r>
       <w:r>
         <w:t xml:space="preserve">. The number of reads per taxa was aggregated on the family and genus levels using the </w:t>
@@ -3225,12 +3309,12 @@
       <w:r>
         <w:t>} package and then used to calculate the relative abundance of each tax</w:t>
       </w:r>
-      <w:del w:id="35" w:author="Marshall, Andrew" w:date="2025-04-22T16:25:00Z" w16du:dateUtc="2025-04-22T20:25:00Z">
+      <w:del w:id="44" w:author="Marshall, Andrew" w:date="2025-04-22T16:25:00Z" w16du:dateUtc="2025-04-22T20:25:00Z">
         <w:r>
           <w:delText>a</w:delText>
         </w:r>
       </w:del>
-      <w:ins w:id="36" w:author="Marshall, Andrew" w:date="2025-04-22T16:25:00Z" w16du:dateUtc="2025-04-22T20:25:00Z">
+      <w:ins w:id="45" w:author="Marshall, Andrew" w:date="2025-04-22T16:25:00Z" w16du:dateUtc="2025-04-22T20:25:00Z">
         <w:r>
           <w:t>on</w:t>
         </w:r>
@@ -3238,12 +3322,12 @@
       <w:r>
         <w:t xml:space="preserve"> by dividing the number of reads per tax</w:t>
       </w:r>
-      <w:del w:id="37" w:author="Marshall, Andrew" w:date="2025-04-22T16:25:00Z" w16du:dateUtc="2025-04-22T20:25:00Z">
+      <w:del w:id="46" w:author="Marshall, Andrew" w:date="2025-04-22T16:25:00Z" w16du:dateUtc="2025-04-22T20:25:00Z">
         <w:r>
           <w:delText>a</w:delText>
         </w:r>
       </w:del>
-      <w:ins w:id="38" w:author="Marshall, Andrew" w:date="2025-04-22T16:25:00Z" w16du:dateUtc="2025-04-22T20:25:00Z">
+      <w:ins w:id="47" w:author="Marshall, Andrew" w:date="2025-04-22T16:25:00Z" w16du:dateUtc="2025-04-22T20:25:00Z">
         <w:r>
           <w:t>on</w:t>
         </w:r>
@@ -3259,12 +3343,12 @@
       <w:r>
         <w:t>We built two generalized linear mixed models (GLMMs) using a negative binomial distribution with a log link function and used individual family and genera abundances as our outcome variables. Negative binomial GLMMs were used because they can effectively model over-dispersed</w:t>
       </w:r>
-      <w:del w:id="39" w:author="Marshall, Andrew" w:date="2025-04-22T16:27:00Z" w16du:dateUtc="2025-04-22T20:27:00Z">
+      <w:del w:id="48" w:author="Marshall, Andrew" w:date="2025-04-22T16:27:00Z" w16du:dateUtc="2025-04-22T20:27:00Z">
         <w:r>
           <w:delText xml:space="preserve">, </w:delText>
         </w:r>
-        <w:commentRangeStart w:id="40"/>
-        <w:commentRangeStart w:id="41"/>
+        <w:commentRangeStart w:id="49"/>
+        <w:commentRangeStart w:id="50"/>
         <w:r>
           <w:delText>zero-inflated</w:delText>
         </w:r>
@@ -3272,24 +3356,24 @@
       <w:r>
         <w:t xml:space="preserve"> </w:t>
       </w:r>
-      <w:commentRangeEnd w:id="40"/>
+      <w:commentRangeEnd w:id="49"/>
       <w:r>
         <w:rPr>
           <w:rStyle w:val="CommentReference"/>
         </w:rPr>
-        <w:commentReference w:id="40"/>
-      </w:r>
-      <w:commentRangeEnd w:id="41"/>
+        <w:commentReference w:id="49"/>
+      </w:r>
+      <w:commentRangeEnd w:id="50"/>
       <w:r>
         <w:rPr>
           <w:rStyle w:val="CommentReference"/>
         </w:rPr>
-        <w:commentReference w:id="41"/>
+        <w:commentReference w:id="50"/>
       </w:r>
       <w:r>
         <w:t>count data</w:t>
       </w:r>
-      <w:ins w:id="42" w:author="Marshall, Andrew" w:date="2025-04-22T16:27:00Z" w16du:dateUtc="2025-04-22T20:27:00Z">
+      <w:ins w:id="51" w:author="Marshall, Andrew" w:date="2025-04-22T16:27:00Z" w16du:dateUtc="2025-04-22T20:27:00Z">
         <w:r>
           <w:t xml:space="preserve"> with an abundance of zeros, a pattern</w:t>
         </w:r>
@@ -3297,7 +3381,7 @@
       <w:r>
         <w:t xml:space="preserve"> typical of microbiome datasets</w:t>
       </w:r>
-      <w:ins w:id="43" w:author="Marshall, Andrew" w:date="2025-04-22T16:27:00Z" w16du:dateUtc="2025-04-22T20:27:00Z">
+      <w:ins w:id="52" w:author="Marshall, Andrew" w:date="2025-04-22T16:27:00Z" w16du:dateUtc="2025-04-22T20:27:00Z">
         <w:r>
           <w:t>.</w:t>
         </w:r>
@@ -3305,17 +3389,18 @@
       <w:r>
         <w:t xml:space="preserve"> </w:t>
       </w:r>
-      <w:del w:id="44" w:author="Marshall, Andrew" w:date="2025-04-22T16:27:00Z" w16du:dateUtc="2025-04-22T20:27:00Z">
+      <w:del w:id="53" w:author="Marshall, Andrew" w:date="2025-04-22T16:27:00Z" w16du:dateUtc="2025-04-22T20:27:00Z">
         <w:r>
+          <w:lastRenderedPageBreak/>
           <w:delText xml:space="preserve">and </w:delText>
         </w:r>
       </w:del>
-      <w:del w:id="45" w:author="Marshall, Andrew" w:date="2025-04-22T16:28:00Z" w16du:dateUtc="2025-04-22T20:28:00Z">
+      <w:del w:id="54" w:author="Marshall, Andrew" w:date="2025-04-22T16:28:00Z" w16du:dateUtc="2025-04-22T20:28:00Z">
         <w:r>
           <w:delText>can</w:delText>
         </w:r>
       </w:del>
-      <w:ins w:id="46" w:author="Marshall, Andrew" w:date="2025-04-22T16:28:00Z" w16du:dateUtc="2025-04-22T20:28:00Z">
+      <w:ins w:id="55" w:author="Marshall, Andrew" w:date="2025-04-22T16:28:00Z" w16du:dateUtc="2025-04-22T20:28:00Z">
         <w:r>
           <w:t>We</w:t>
         </w:r>
@@ -3323,7 +3408,7 @@
       <w:r>
         <w:t xml:space="preserve"> account</w:t>
       </w:r>
-      <w:ins w:id="47" w:author="Marshall, Andrew" w:date="2025-04-22T16:28:00Z" w16du:dateUtc="2025-04-22T20:28:00Z">
+      <w:ins w:id="56" w:author="Marshall, Andrew" w:date="2025-04-22T16:28:00Z" w16du:dateUtc="2025-04-22T20:28:00Z">
         <w:r>
           <w:t>ed</w:t>
         </w:r>
@@ -3331,7 +3416,7 @@
       <w:r>
         <w:t xml:space="preserve"> for repeated measurements in </w:t>
       </w:r>
-      <w:del w:id="48" w:author="Marshall, Andrew" w:date="2025-04-22T16:28:00Z" w16du:dateUtc="2025-04-22T20:28:00Z">
+      <w:del w:id="57" w:author="Marshall, Andrew" w:date="2025-04-22T16:28:00Z" w16du:dateUtc="2025-04-22T20:28:00Z">
         <w:r>
           <w:delText xml:space="preserve">longitudinal studies </w:delText>
         </w:r>
@@ -3339,17 +3424,16 @@
       <w:r>
         <w:t xml:space="preserve">by </w:t>
       </w:r>
-      <w:commentRangeStart w:id="49"/>
-      <w:r>
-        <w:lastRenderedPageBreak/>
+      <w:commentRangeStart w:id="58"/>
+      <w:r>
         <w:t xml:space="preserve">incorporating random effects </w:t>
       </w:r>
-      <w:commentRangeEnd w:id="49"/>
+      <w:commentRangeEnd w:id="58"/>
       <w:r>
         <w:rPr>
           <w:rStyle w:val="CommentReference"/>
         </w:rPr>
-        <w:commentReference w:id="49"/>
+        <w:commentReference w:id="58"/>
       </w:r>
       <w:r>
         <w:fldChar w:fldCharType="begin"/>
@@ -3378,27 +3462,27 @@
       <w:r>
         <w:t xml:space="preserve">Each </w:t>
       </w:r>
-      <w:commentRangeStart w:id="50"/>
+      <w:commentRangeStart w:id="59"/>
       <w:r>
         <w:t>tax</w:t>
       </w:r>
-      <w:del w:id="51" w:author="Marshall, Andrew" w:date="2025-04-22T16:28:00Z" w16du:dateUtc="2025-04-22T20:28:00Z">
+      <w:del w:id="60" w:author="Marshall, Andrew" w:date="2025-04-22T16:28:00Z" w16du:dateUtc="2025-04-22T20:28:00Z">
         <w:r>
           <w:delText>a</w:delText>
         </w:r>
       </w:del>
-      <w:ins w:id="52" w:author="Marshall, Andrew" w:date="2025-04-22T16:28:00Z" w16du:dateUtc="2025-04-22T20:28:00Z">
+      <w:ins w:id="61" w:author="Marshall, Andrew" w:date="2025-04-22T16:28:00Z" w16du:dateUtc="2025-04-22T20:28:00Z">
         <w:r>
           <w:t>on</w:t>
         </w:r>
       </w:ins>
-      <w:commentRangeEnd w:id="50"/>
-      <w:ins w:id="53" w:author="Marshall, Andrew" w:date="2025-04-22T16:29:00Z" w16du:dateUtc="2025-04-22T20:29:00Z">
+      <w:commentRangeEnd w:id="59"/>
+      <w:ins w:id="62" w:author="Marshall, Andrew" w:date="2025-04-22T16:29:00Z" w16du:dateUtc="2025-04-22T20:29:00Z">
         <w:r>
           <w:rPr>
             <w:rStyle w:val="CommentReference"/>
           </w:rPr>
-          <w:commentReference w:id="50"/>
+          <w:commentReference w:id="59"/>
         </w:r>
       </w:ins>
       <w:r>
@@ -3446,7 +3530,23 @@
       </w:r>
       <w:proofErr w:type="spellEnd"/>
       <w:r>
-        <w:t xml:space="preserve">, included all of the same predictors with an additional predictor for temperature. Both models included a random intercept for individuals to control for repeated sampling and an offset for the log-transformed number of reads to control for differences in sequencing depth between samples. Similar to our community feature analysis, fruit consumption was included to better isolate the relationship between temperature and individual taxa while accounting for diet components also related to temperature. However, we did not include diet diversity as a predictor to reduce model complexity and facilitate model convergence. We scaled all continuous predictors. Model weights were used to evaluate the importance of temperature as a predictor of individual taxa abundance. Taxa where </w:t>
+        <w:t xml:space="preserve">, included </w:t>
+      </w:r>
+      <w:proofErr w:type="gramStart"/>
+      <w:r>
+        <w:t>all of</w:t>
+      </w:r>
+      <w:proofErr w:type="gramEnd"/>
+      <w:r>
+        <w:t xml:space="preserve"> the same predictors with an additional predictor for temperature. Both models included a random intercept for individuals to control for repeated sampling and an offset for the log-transformed number of reads to control for differences in sequencing depth between samples. </w:t>
+      </w:r>
+      <w:proofErr w:type="gramStart"/>
+      <w:r>
+        <w:t>Similar to</w:t>
+      </w:r>
+      <w:proofErr w:type="gramEnd"/>
+      <w:r>
+        <w:t xml:space="preserve"> our community feature analysis, fruit consumption was included to better isolate the relationship between temperature and individual taxa while accounting for diet components also related to temperature. However, we did not include diet diversity as a predictor to reduce model complexity and facilitate model convergence. We scaled all continuous predictors. Model weights were used to evaluate the importance of temperature as a predictor of individual taxa abundance. Taxa where </w:t>
       </w:r>
       <w:proofErr w:type="spellStart"/>
       <w:r>
@@ -3468,9 +3568,11 @@
       <w:r>
         <w:t xml:space="preserve">Given that </w:t>
       </w:r>
+      <w:proofErr w:type="gramStart"/>
       <w:r>
         <w:t>the majority of</w:t>
       </w:r>
+      <w:proofErr w:type="gramEnd"/>
       <w:r>
         <w:t xml:space="preserve"> individual taxa exhibited a negative relationship with temperature, we used another comparative modeling approach to assess whether </w:t>
       </w:r>
@@ -3492,9 +3594,17 @@
       <w:r>
         <w:t xml:space="preserve"> held greater than 50% of the model weight</w:t>
       </w:r>
-      <w:ins w:id="54" w:author="Marshall, Andrew" w:date="2025-04-22T16:30:00Z" w16du:dateUtc="2025-04-22T20:30:00Z">
+      <w:ins w:id="63" w:author="Marshall, Andrew" w:date="2025-04-22T16:30:00Z" w16du:dateUtc="2025-04-22T20:30:00Z">
         <w:r>
-          <w:t xml:space="preserve"> in a two model comparison with </w:t>
+          <w:t xml:space="preserve"> in a </w:t>
+        </w:r>
+        <w:proofErr w:type="gramStart"/>
+        <w:r>
+          <w:t>two model</w:t>
+        </w:r>
+        <w:proofErr w:type="gramEnd"/>
+        <w:r>
+          <w:t xml:space="preserve"> comparison with </w:t>
         </w:r>
         <w:proofErr w:type="spellStart"/>
         <w:r>
@@ -3509,13 +3619,13 @@
       <w:r>
         <w:t>). Then, we filtered for taxa with a negative beta coefficient for temperature. We built two generalized additive models (</w:t>
       </w:r>
-      <w:commentRangeStart w:id="55"/>
-      <w:commentRangeStart w:id="56"/>
-      <w:commentRangeStart w:id="57"/>
+      <w:commentRangeStart w:id="64"/>
+      <w:commentRangeStart w:id="65"/>
+      <w:commentRangeStart w:id="66"/>
       <w:r>
         <w:t>GAM</w:t>
       </w:r>
-      <w:ins w:id="58" w:author="Marshall, Andrew" w:date="2025-04-22T16:46:00Z" w16du:dateUtc="2025-04-22T20:46:00Z">
+      <w:ins w:id="67" w:author="Marshall, Andrew" w:date="2025-04-22T16:46:00Z" w16du:dateUtc="2025-04-22T20:46:00Z">
         <w:r>
           <w:t>M</w:t>
         </w:r>
@@ -3523,29 +3633,29 @@
       <w:r>
         <w:t>s</w:t>
       </w:r>
-      <w:commentRangeEnd w:id="55"/>
+      <w:commentRangeEnd w:id="64"/>
       <w:r>
         <w:rPr>
           <w:rStyle w:val="CommentReference"/>
         </w:rPr>
-        <w:commentReference w:id="55"/>
-      </w:r>
-      <w:commentRangeEnd w:id="56"/>
+        <w:commentReference w:id="64"/>
+      </w:r>
+      <w:commentRangeEnd w:id="65"/>
       <w:r>
         <w:rPr>
           <w:rStyle w:val="CommentReference"/>
         </w:rPr>
-        <w:commentReference w:id="56"/>
+        <w:commentReference w:id="65"/>
       </w:r>
       <w:r>
         <w:t xml:space="preserve">) </w:t>
       </w:r>
-      <w:commentRangeEnd w:id="57"/>
+      <w:commentRangeEnd w:id="66"/>
       <w:r>
         <w:rPr>
           <w:rStyle w:val="CommentReference"/>
         </w:rPr>
-        <w:commentReference w:id="57"/>
+        <w:commentReference w:id="66"/>
       </w:r>
       <w:r>
         <w:t>using a negative binomial distribution with a log link function</w:t>
@@ -3568,7 +3678,7 @@
       <w:r>
         <w:t xml:space="preserve"> </w:t>
       </w:r>
-      <w:del w:id="59" w:author="Marshall, Andrew" w:date="2025-04-22T16:31:00Z" w16du:dateUtc="2025-04-22T20:31:00Z">
+      <w:del w:id="68" w:author="Marshall, Andrew" w:date="2025-04-22T16:31:00Z" w16du:dateUtc="2025-04-22T20:31:00Z">
         <w:r>
           <w:delText xml:space="preserve"> </w:delText>
         </w:r>
@@ -3576,7 +3686,7 @@
       <w:r>
         <w:t xml:space="preserve">(i.e. social group, age, sex, rainfall, fruit consumption, temperature, random effect for ID, log total reads offset), but the first model, </w:t>
       </w:r>
-      <w:commentRangeStart w:id="60"/>
+      <w:commentRangeStart w:id="69"/>
       <w:proofErr w:type="spellStart"/>
       <w:r>
         <w:rPr>
@@ -3585,13 +3695,13 @@
         </w:rPr>
         <w:t>gam_main</w:t>
       </w:r>
-      <w:commentRangeEnd w:id="60"/>
+      <w:commentRangeEnd w:id="69"/>
       <w:proofErr w:type="spellEnd"/>
       <w:r>
         <w:rPr>
           <w:rStyle w:val="CommentReference"/>
         </w:rPr>
-        <w:commentReference w:id="60"/>
+        <w:commentReference w:id="69"/>
       </w:r>
       <w:r>
         <w:t>, modeled temperature as a linear predictor</w:t>
@@ -3614,12 +3724,20 @@
       <w:r>
         <w:t>, modeled temperature with a spline. Using a spline to model the temperature predictor allowed the model to evaluate the non-linear relationship between temperature and taxa abundance.</w:t>
       </w:r>
-      <w:commentRangeStart w:id="61"/>
-      <w:r>
-        <w:t xml:space="preserve"> </w:t>
-      </w:r>
-      <w:r>
-        <w:t xml:space="preserve">We scaled all continuous predictors. Each taxa was modeled twice, once with each model, and model fit was compared using </w:t>
+      <w:commentRangeStart w:id="70"/>
+      <w:r>
+        <w:t xml:space="preserve"> </w:t>
+      </w:r>
+      <w:r>
+        <w:t xml:space="preserve">We scaled all continuous predictors. Each </w:t>
+      </w:r>
+      <w:proofErr w:type="gramStart"/>
+      <w:r>
+        <w:t>taxa</w:t>
+      </w:r>
+      <w:proofErr w:type="gramEnd"/>
+      <w:r>
+        <w:t xml:space="preserve"> was modeled twice, once with each model, and model fit was compared using </w:t>
       </w:r>
       <w:proofErr w:type="spellStart"/>
       <w:r>
@@ -3648,12 +3766,12 @@
       <w:r>
         <w:t>held greater than 50% of the model weight were considered to have a non-linear relationship with temperature.</w:t>
       </w:r>
-      <w:commentRangeEnd w:id="61"/>
+      <w:commentRangeEnd w:id="70"/>
       <w:r>
         <w:rPr>
           <w:rStyle w:val="CommentReference"/>
         </w:rPr>
-        <w:commentReference w:id="61"/>
+        <w:commentReference w:id="70"/>
       </w:r>
     </w:p>
     <w:p>
@@ -3770,12 +3888,12 @@
       <w:r>
         <w:t xml:space="preserve">. The results of each of the three clusters were visualized by plotting the predictions for each </w:t>
       </w:r>
-      <w:del w:id="62" w:author="Marshall, Andrew" w:date="2025-04-22T16:49:00Z" w16du:dateUtc="2025-04-22T20:49:00Z">
+      <w:del w:id="71" w:author="Marshall, Andrew" w:date="2025-04-22T16:49:00Z" w16du:dateUtc="2025-04-22T20:49:00Z">
         <w:r>
           <w:delText>taxa</w:delText>
         </w:r>
       </w:del>
-      <w:ins w:id="63" w:author="Marshall, Andrew" w:date="2025-04-22T16:49:00Z" w16du:dateUtc="2025-04-22T20:49:00Z">
+      <w:ins w:id="72" w:author="Marshall, Andrew" w:date="2025-04-22T16:49:00Z" w16du:dateUtc="2025-04-22T20:49:00Z">
         <w:r>
           <w:t>taxon</w:t>
         </w:r>
@@ -3803,7 +3921,15 @@
         <w:ind w:firstLine="720"/>
       </w:pPr>
       <w:r>
-        <w:t xml:space="preserve">To assess whether the relationship between temperature and community composition is associated with immune performance, we employed a third comparative modeling approach and used alpha diversity and the first four principal components as outcome variables. Similar to our previous approach, each community feature was modeled twice, once with each model, and </w:t>
+        <w:t xml:space="preserve">To assess whether the relationship between temperature and community composition is associated with immune performance, we employed a third comparative modeling approach and used alpha diversity and the first four principal components as outcome variables. </w:t>
+      </w:r>
+      <w:proofErr w:type="gramStart"/>
+      <w:r>
+        <w:t>Similar to</w:t>
+      </w:r>
+      <w:proofErr w:type="gramEnd"/>
+      <w:r>
+        <w:t xml:space="preserve"> our previous approach, each community feature was modeled twice, once with each model, and </w:t>
       </w:r>
       <w:r>
         <w:lastRenderedPageBreak/>
@@ -3857,7 +3983,15 @@
         <w:t xml:space="preserve"> </w:t>
       </w:r>
       <w:r>
-        <w:t xml:space="preserve">included all of the same predictors with an additional interaction effect between temperature and neopterin. The interaction effect allowed us to test if the relationship between community composition changes depending on neopterin levels. We scaled all continuous predictors, including neopterin. All models were fit as linear mixed models (LMM’s) with a Gaussian distribution except for observed richness, which was fit using a Gamma distribution with a log link function because the variable was </w:t>
+        <w:t xml:space="preserve">included </w:t>
+      </w:r>
+      <w:proofErr w:type="gramStart"/>
+      <w:r>
+        <w:t>all of</w:t>
+      </w:r>
+      <w:proofErr w:type="gramEnd"/>
+      <w:r>
+        <w:t xml:space="preserve"> the same predictors with an additional interaction effect between temperature and neopterin. The interaction effect allowed us to test if the relationship between community composition changes depending on neopterin levels. We scaled all continuous predictors, including neopterin. All models were fit as linear mixed models (LMM’s) with a Gaussian distribution except for observed richness, which was fit using a Gamma distribution with a log link function because the variable was </w:t>
       </w:r>
       <w:r>
         <w:t>continuous, positive, and left</w:t>
@@ -3879,12 +4013,12 @@
       <w:r>
         <w:t>To assess whether the relationship between temperature and individual taxa is associated with immune performance, we employed the same model comparison approach but used tax</w:t>
       </w:r>
-      <w:ins w:id="64" w:author="Marshall, Andrew" w:date="2025-04-22T16:50:00Z" w16du:dateUtc="2025-04-22T20:50:00Z">
+      <w:ins w:id="73" w:author="Marshall, Andrew" w:date="2025-04-22T16:50:00Z" w16du:dateUtc="2025-04-22T20:50:00Z">
         <w:r>
           <w:t>on</w:t>
         </w:r>
       </w:ins>
-      <w:del w:id="65" w:author="Marshall, Andrew" w:date="2025-04-22T16:50:00Z" w16du:dateUtc="2025-04-22T20:50:00Z">
+      <w:del w:id="74" w:author="Marshall, Andrew" w:date="2025-04-22T16:50:00Z" w16du:dateUtc="2025-04-22T20:50:00Z">
         <w:r>
           <w:delText>a</w:delText>
         </w:r>
@@ -3948,16 +4082,16 @@
       <w:r>
         <w:t xml:space="preserve"> held greater than 50% of the model weight were considered to have a relationship between temperature and abundance that changes depending on neopterin levels. These taxa were then visualized using a coplot, where the relationship between taxa abundance and temperature was plotted over three ranges of neopterin </w:t>
       </w:r>
-      <w:commentRangeStart w:id="66"/>
+      <w:commentRangeStart w:id="75"/>
       <w:r>
         <w:t>values</w:t>
       </w:r>
-      <w:commentRangeEnd w:id="66"/>
+      <w:commentRangeEnd w:id="75"/>
       <w:r>
         <w:rPr>
           <w:rStyle w:val="CommentReference"/>
         </w:rPr>
-        <w:commentReference w:id="66"/>
+        <w:commentReference w:id="75"/>
       </w:r>
       <w:r>
         <w:t xml:space="preserve">. </w:t>
@@ -4111,9 +4245,14 @@
       <w:pPr>
         <w:ind w:firstLine="720"/>
       </w:pPr>
-      <w:commentRangeStart w:id="67"/>
-      <w:r>
-        <w:t>Similar to the community-level analysis</w:t>
+      <w:commentRangeStart w:id="76"/>
+      <w:proofErr w:type="gramStart"/>
+      <w:r>
+        <w:t>Similar to</w:t>
+      </w:r>
+      <w:proofErr w:type="gramEnd"/>
+      <w:r>
+        <w:t xml:space="preserve"> the community-level analysis</w:t>
       </w:r>
       <w:r>
         <w:t xml:space="preserve">, we found that temperature </w:t>
@@ -4146,11 +4285,16 @@
         <w:t>s</w:t>
       </w:r>
       <w:r>
-        <w:t xml:space="preserve"> temperature as a predictor account</w:t>
+        <w:t xml:space="preserve"> temperature as a </w:t>
+      </w:r>
+      <w:proofErr w:type="gramStart"/>
+      <w:r>
+        <w:t>predictor account</w:t>
       </w:r>
       <w:r>
         <w:t>s</w:t>
       </w:r>
+      <w:proofErr w:type="gramEnd"/>
       <w:r>
         <w:t xml:space="preserve"> for more than 50% of the model weight. Among the 93 differentially abundant taxa, 38 </w:t>
       </w:r>
@@ -4178,19 +4322,19 @@
       <w:r>
         <w:t xml:space="preserve"> 83 of the taxa decline in abundance with increasing temperatures (</w:t>
       </w:r>
-      <w:commentRangeStart w:id="68"/>
+      <w:commentRangeStart w:id="77"/>
       <w:r>
         <w:t>Fig 3</w:t>
       </w:r>
       <w:r>
         <w:t>, coming soon</w:t>
       </w:r>
-      <w:commentRangeEnd w:id="68"/>
+      <w:commentRangeEnd w:id="77"/>
       <w:r>
         <w:rPr>
           <w:rStyle w:val="CommentReference"/>
         </w:rPr>
-        <w:commentReference w:id="68"/>
+        <w:commentReference w:id="77"/>
       </w:r>
       <w:r>
         <w:t>)</w:t>
@@ -4204,12 +4348,12 @@
       <w:r>
         <w:t xml:space="preserve">observed across the major </w:t>
       </w:r>
-      <w:commentRangeEnd w:id="67"/>
+      <w:commentRangeEnd w:id="76"/>
       <w:r>
         <w:rPr>
           <w:rStyle w:val="CommentReference"/>
         </w:rPr>
-        <w:commentReference w:id="67"/>
+        <w:commentReference w:id="76"/>
       </w:r>
       <w:r>
         <w:t>phyla</w:t>
@@ -4277,7 +4421,7 @@
       <w:r>
         <w:t xml:space="preserve"> grouped into three main clusters, with the first cluster containing the most taxa (24 out of the total 36 taxa)(</w:t>
       </w:r>
-      <w:commentRangeStart w:id="69"/>
+      <w:commentRangeStart w:id="78"/>
       <w:r>
         <w:t xml:space="preserve">Fig </w:t>
       </w:r>
@@ -4287,12 +4431,12 @@
       <w:r>
         <w:t>S</w:t>
       </w:r>
-      <w:commentRangeEnd w:id="69"/>
+      <w:commentRangeEnd w:id="78"/>
       <w:r>
         <w:rPr>
           <w:rStyle w:val="CommentReference"/>
         </w:rPr>
-        <w:commentReference w:id="69"/>
+        <w:commentReference w:id="78"/>
       </w:r>
       <w:r>
         <w:t>). This cluster exhibit</w:t>
@@ -4391,24 +4535,32 @@
       <w:r>
         <w:t xml:space="preserve">We evaluated whether adding an interaction effect between temperature and neopterin to our model that already included temperature as a predictor </w:t>
       </w:r>
-      <w:commentRangeStart w:id="70"/>
-      <w:commentRangeStart w:id="71"/>
+      <w:commentRangeStart w:id="79"/>
+      <w:commentRangeStart w:id="80"/>
+      <w:commentRangeStart w:id="81"/>
       <w:r>
         <w:t xml:space="preserve">would improve the model fit </w:t>
       </w:r>
-      <w:commentRangeEnd w:id="70"/>
+      <w:commentRangeEnd w:id="79"/>
       <w:r>
         <w:rPr>
           <w:rStyle w:val="CommentReference"/>
         </w:rPr>
-        <w:commentReference w:id="70"/>
-      </w:r>
-      <w:commentRangeEnd w:id="71"/>
+        <w:commentReference w:id="79"/>
+      </w:r>
+      <w:commentRangeEnd w:id="80"/>
       <w:r>
         <w:rPr>
           <w:rStyle w:val="CommentReference"/>
         </w:rPr>
-        <w:commentReference w:id="71"/>
+        <w:commentReference w:id="80"/>
+      </w:r>
+      <w:commentRangeEnd w:id="81"/>
+      <w:r>
+        <w:rPr>
+          <w:rStyle w:val="CommentReference"/>
+        </w:rPr>
+        <w:commentReference w:id="81"/>
       </w:r>
       <w:r>
         <w:t>for the community</w:t>
@@ -4506,16 +4658,16 @@
       <w:r>
         <w:t xml:space="preserve">of neopterin </w:t>
       </w:r>
-      <w:commentRangeStart w:id="72"/>
+      <w:commentRangeStart w:id="82"/>
       <w:r>
         <w:t xml:space="preserve">concentration. </w:t>
       </w:r>
-      <w:commentRangeEnd w:id="72"/>
+      <w:commentRangeEnd w:id="82"/>
       <w:r>
         <w:rPr>
           <w:rStyle w:val="CommentReference"/>
         </w:rPr>
-        <w:commentReference w:id="72"/>
+        <w:commentReference w:id="82"/>
       </w:r>
     </w:p>
     <w:p>
@@ -4668,11 +4820,16 @@
       <w:r>
         <w:t xml:space="preserve">The negative and positive amplifying effects suggest that a stronger relationship with temperature is associated with high neopterin concentration. The reverse effect suggests that a negative relationship with temperature is associated with low neopterin concentration while a positive relationship is associated with high neopterin. </w:t>
       </w:r>
+      <w:proofErr w:type="gramStart"/>
       <w:r>
         <w:t>T</w:t>
       </w:r>
       <w:r>
-        <w:t>he majority of taxa (13 out of 24) exhibi</w:t>
+        <w:t>he majority of</w:t>
+      </w:r>
+      <w:proofErr w:type="gramEnd"/>
+      <w:r>
+        <w:t xml:space="preserve"> taxa (13 out of 24) exhibi</w:t>
       </w:r>
       <w:r>
         <w:t>t</w:t>
@@ -4686,16 +4843,16 @@
     </w:p>
     <w:p/>
     <w:p>
-      <w:commentRangeStart w:id="73"/>
+      <w:commentRangeStart w:id="83"/>
       <w:r>
         <w:t xml:space="preserve">Discussion: </w:t>
       </w:r>
-      <w:commentRangeEnd w:id="73"/>
+      <w:commentRangeEnd w:id="83"/>
       <w:r>
         <w:rPr>
           <w:rStyle w:val="CommentReference"/>
         </w:rPr>
-        <w:commentReference w:id="73"/>
+        <w:commentReference w:id="83"/>
       </w:r>
     </w:p>
     <w:p>
@@ -4841,7 +4998,7 @@
       <w:r>
         <w:t xml:space="preserve">, </w:t>
       </w:r>
-      <w:commentRangeStart w:id="74"/>
+      <w:commentRangeStart w:id="84"/>
       <w:r>
         <w:t xml:space="preserve">and </w:t>
       </w:r>
@@ -4851,12 +5008,12 @@
       <w:r>
         <w:t xml:space="preserve"> </w:t>
       </w:r>
-      <w:commentRangeEnd w:id="74"/>
+      <w:commentRangeEnd w:id="84"/>
       <w:r>
         <w:rPr>
           <w:rStyle w:val="CommentReference"/>
         </w:rPr>
-        <w:commentReference w:id="74"/>
+        <w:commentReference w:id="84"/>
       </w:r>
       <w:r>
         <w:fldChar w:fldCharType="begin"/>
@@ -5585,24 +5742,24 @@
       <w:r>
         <w:t xml:space="preserve"> gut </w:t>
       </w:r>
-      <w:commentRangeStart w:id="75"/>
-      <w:commentRangeStart w:id="76"/>
+      <w:commentRangeStart w:id="85"/>
+      <w:commentRangeStart w:id="86"/>
       <w:r>
         <w:t>microbiome</w:t>
       </w:r>
-      <w:commentRangeEnd w:id="75"/>
+      <w:commentRangeEnd w:id="85"/>
       <w:r>
         <w:rPr>
           <w:rStyle w:val="CommentReference"/>
         </w:rPr>
-        <w:commentReference w:id="75"/>
-      </w:r>
-      <w:commentRangeEnd w:id="76"/>
+        <w:commentReference w:id="85"/>
+      </w:r>
+      <w:commentRangeEnd w:id="86"/>
       <w:r>
         <w:rPr>
           <w:rStyle w:val="CommentReference"/>
         </w:rPr>
-        <w:commentReference w:id="76"/>
+        <w:commentReference w:id="86"/>
       </w:r>
       <w:r>
         <w:t>.</w:t>
@@ -6273,16 +6430,16 @@
       <w:r>
         <w:t xml:space="preserve"> mechanism by which climate change could negatively impact wild animal </w:t>
       </w:r>
-      <w:commentRangeStart w:id="77"/>
+      <w:commentRangeStart w:id="87"/>
       <w:r>
         <w:t xml:space="preserve">populations. </w:t>
       </w:r>
-      <w:commentRangeEnd w:id="77"/>
+      <w:commentRangeEnd w:id="87"/>
       <w:r>
         <w:rPr>
           <w:rStyle w:val="CommentReference"/>
         </w:rPr>
-        <w:commentReference w:id="77"/>
+        <w:commentReference w:id="87"/>
       </w:r>
     </w:p>
     <w:p/>
@@ -6668,7 +6825,15 @@
         <w:t>associated with higher levels of neopterin</w:t>
       </w:r>
       <w:r>
-        <w:t xml:space="preserve"> and the majority of taxa show this effect. Conversely, the positive amplifying effect suggests that a stronger positive relationship with temperature is also associated with higher neopterin. </w:t>
+        <w:t xml:space="preserve"> and </w:t>
+      </w:r>
+      <w:proofErr w:type="gramStart"/>
+      <w:r>
+        <w:t>the majority of</w:t>
+      </w:r>
+      <w:proofErr w:type="gramEnd"/>
+      <w:r>
+        <w:t xml:space="preserve"> taxa show this effect. Conversely, the positive amplifying effect suggests that a stronger positive relationship with temperature is also associated with higher neopterin. </w:t>
       </w:r>
       <w:r>
         <w:t xml:space="preserve">The reverse effect occurs when taxa can have either a positive or negative relationship with temperature—where negative relationships are associated with lower neopterin levels, while positive relationships are associated with higher neopterin levels. </w:t>
@@ -7112,10 +7277,18 @@
         <w:t xml:space="preserve">because more microbes are available to upregulate immune function. </w:t>
       </w:r>
       <w:r>
-        <w:t xml:space="preserve">For all </w:t>
-      </w:r>
-      <w:r>
-        <w:t xml:space="preserve">of these </w:t>
+        <w:t xml:space="preserve">For </w:t>
+      </w:r>
+      <w:proofErr w:type="gramStart"/>
+      <w:r>
+        <w:t xml:space="preserve">all </w:t>
+      </w:r>
+      <w:r>
+        <w:t>of</w:t>
+      </w:r>
+      <w:proofErr w:type="gramEnd"/>
+      <w:r>
+        <w:t xml:space="preserve"> these </w:t>
       </w:r>
       <w:r>
         <w:t xml:space="preserve">effects, a strong </w:t>
@@ -7165,16 +7338,16 @@
       <w:r>
         <w:t xml:space="preserve"> </w:t>
       </w:r>
-      <w:commentRangeStart w:id="78"/>
+      <w:commentRangeStart w:id="88"/>
       <w:r>
         <w:t>elevated temperatures could negatively impact host health through their effects on the gut-immune axis.</w:t>
       </w:r>
-      <w:commentRangeEnd w:id="78"/>
+      <w:commentRangeEnd w:id="88"/>
       <w:r>
         <w:rPr>
           <w:rStyle w:val="CommentReference"/>
         </w:rPr>
-        <w:commentReference w:id="78"/>
+        <w:commentReference w:id="88"/>
       </w:r>
     </w:p>
     <w:p>
@@ -7232,11 +7405,11 @@
       <w:r>
         <w:t xml:space="preserve">response to temperature could, in turn, amplify its effects on the microbiome. </w:t>
       </w:r>
-      <w:commentRangeStart w:id="79"/>
-      <w:commentRangeStart w:id="80"/>
-      <w:commentRangeStart w:id="81"/>
-      <w:commentRangeStart w:id="82"/>
-      <w:commentRangeStart w:id="83"/>
+      <w:commentRangeStart w:id="89"/>
+      <w:commentRangeStart w:id="90"/>
+      <w:commentRangeStart w:id="91"/>
+      <w:commentRangeStart w:id="92"/>
+      <w:commentRangeStart w:id="93"/>
       <w:r>
         <w:t xml:space="preserve">However, we predict that immune-drive effects would likely impact the entire microbiome and result in community-level effects, such as a reduction in alpha </w:t>
       </w:r>
@@ -7250,40 +7423,40 @@
       <w:r>
         <w:t xml:space="preserve"> specific microbes</w:t>
       </w:r>
-      <w:commentRangeEnd w:id="79"/>
+      <w:commentRangeEnd w:id="89"/>
       <w:r>
         <w:rPr>
           <w:rStyle w:val="CommentReference"/>
         </w:rPr>
-        <w:commentReference w:id="79"/>
-      </w:r>
-      <w:commentRangeEnd w:id="80"/>
+        <w:commentReference w:id="89"/>
+      </w:r>
+      <w:commentRangeEnd w:id="90"/>
       <w:r>
         <w:rPr>
           <w:rStyle w:val="CommentReference"/>
         </w:rPr>
-        <w:commentReference w:id="80"/>
-      </w:r>
-      <w:commentRangeEnd w:id="81"/>
+        <w:commentReference w:id="90"/>
+      </w:r>
+      <w:commentRangeEnd w:id="91"/>
       <w:r>
         <w:rPr>
           <w:rStyle w:val="CommentReference"/>
         </w:rPr>
-        <w:commentReference w:id="81"/>
-      </w:r>
-      <w:commentRangeEnd w:id="82"/>
+        <w:commentReference w:id="91"/>
+      </w:r>
+      <w:commentRangeEnd w:id="92"/>
       <w:r>
         <w:rPr>
           <w:rStyle w:val="CommentReference"/>
         </w:rPr>
-        <w:commentReference w:id="82"/>
-      </w:r>
-      <w:commentRangeEnd w:id="83"/>
+        <w:commentReference w:id="92"/>
+      </w:r>
+      <w:commentRangeEnd w:id="93"/>
       <w:r>
         <w:rPr>
           <w:rStyle w:val="CommentReference"/>
         </w:rPr>
-        <w:commentReference w:id="83"/>
+        <w:commentReference w:id="93"/>
       </w:r>
       <w:r>
         <w:t>. O</w:t>
@@ -7303,24 +7476,24 @@
       <w:r>
         <w:t xml:space="preserve">temperature can affect immune </w:t>
       </w:r>
-      <w:commentRangeStart w:id="84"/>
-      <w:commentRangeStart w:id="85"/>
+      <w:commentRangeStart w:id="94"/>
+      <w:commentRangeStart w:id="95"/>
       <w:r>
         <w:t xml:space="preserve">activity. </w:t>
       </w:r>
-      <w:commentRangeEnd w:id="84"/>
+      <w:commentRangeEnd w:id="94"/>
       <w:r>
         <w:rPr>
           <w:rStyle w:val="CommentReference"/>
         </w:rPr>
-        <w:commentReference w:id="84"/>
-      </w:r>
-      <w:commentRangeEnd w:id="85"/>
+        <w:commentReference w:id="94"/>
+      </w:r>
+      <w:commentRangeEnd w:id="95"/>
       <w:r>
         <w:rPr>
           <w:rStyle w:val="CommentReference"/>
         </w:rPr>
-        <w:commentReference w:id="85"/>
+        <w:commentReference w:id="95"/>
       </w:r>
     </w:p>
     <w:p>
@@ -7427,7 +7600,7 @@
       <w:pPr>
         <w:spacing w:before="100" w:beforeAutospacing="1" w:after="100" w:afterAutospacing="1"/>
       </w:pPr>
-      <w:commentRangeStart w:id="86"/>
+      <w:commentRangeStart w:id="96"/>
       <w:r>
         <w:t xml:space="preserve">Our results underscore the significance of temperature as a key environmental driver of microbiome variation, highlighting that elevated temperatures are linked to shifts in composition </w:t>
       </w:r>
@@ -7506,12 +7679,12 @@
       <w:r>
         <w:t xml:space="preserve">. </w:t>
       </w:r>
-      <w:commentRangeEnd w:id="86"/>
+      <w:commentRangeEnd w:id="96"/>
       <w:r>
         <w:rPr>
           <w:rStyle w:val="CommentReference"/>
         </w:rPr>
-        <w:commentReference w:id="86"/>
+        <w:commentReference w:id="96"/>
       </w:r>
     </w:p>
     <w:p>
@@ -7521,7 +7694,7 @@
           <w:szCs w:val="32"/>
         </w:rPr>
       </w:pPr>
-      <w:commentRangeStart w:id="87"/>
+      <w:commentRangeStart w:id="97"/>
       <w:r>
         <w:rPr>
           <w:noProof/>
@@ -7586,12 +7759,12 @@
         </w:rPr>
         <w:t>Figure</w:t>
       </w:r>
-      <w:commentRangeEnd w:id="87"/>
+      <w:commentRangeEnd w:id="97"/>
       <w:r>
         <w:rPr>
           <w:rStyle w:val="CommentReference"/>
         </w:rPr>
-        <w:commentReference w:id="87"/>
+        <w:commentReference w:id="97"/>
       </w:r>
       <w:r>
         <w:rPr>
@@ -8210,9 +8383,9 @@
       </w:r>
     </w:p>
     <w:p>
-      <w:commentRangeStart w:id="88"/>
-      <w:commentRangeStart w:id="89"/>
-      <w:commentRangeStart w:id="90"/>
+      <w:commentRangeStart w:id="98"/>
+      <w:commentRangeStart w:id="99"/>
+      <w:commentRangeStart w:id="100"/>
       <w:r>
         <w:rPr>
           <w:b/>
@@ -8229,12 +8402,12 @@
       <w:r>
         <w:t>Colors represent individual taxa</w:t>
       </w:r>
-      <w:ins w:id="91" w:author="Marshall, Andrew" w:date="2025-04-22T17:02:00Z" w16du:dateUtc="2025-04-22T21:02:00Z">
+      <w:ins w:id="101" w:author="Marshall, Andrew" w:date="2025-04-22T17:02:00Z" w16du:dateUtc="2025-04-22T21:02:00Z">
         <w:r>
           <w:t>.</w:t>
         </w:r>
       </w:ins>
-      <w:del w:id="92" w:author="Marshall, Andrew" w:date="2025-04-22T17:02:00Z" w16du:dateUtc="2025-04-22T21:02:00Z">
+      <w:del w:id="102" w:author="Marshall, Andrew" w:date="2025-04-22T17:02:00Z" w16du:dateUtc="2025-04-22T21:02:00Z">
         <w:r>
           <w:delText xml:space="preserve"> </w:delText>
         </w:r>
@@ -8257,26 +8430,26 @@
       <w:r>
         <w:t>a negative relationship with temperature is associated with low neopterin concentration while a positive relationship is associated with high neopterin.</w:t>
       </w:r>
-      <w:commentRangeEnd w:id="88"/>
+      <w:commentRangeEnd w:id="98"/>
       <w:r>
         <w:rPr>
           <w:rStyle w:val="CommentReference"/>
         </w:rPr>
-        <w:commentReference w:id="88"/>
-      </w:r>
-      <w:commentRangeEnd w:id="89"/>
+        <w:commentReference w:id="98"/>
+      </w:r>
+      <w:commentRangeEnd w:id="99"/>
       <w:r>
         <w:rPr>
           <w:rStyle w:val="CommentReference"/>
         </w:rPr>
-        <w:commentReference w:id="89"/>
-      </w:r>
-      <w:commentRangeEnd w:id="90"/>
+        <w:commentReference w:id="99"/>
+      </w:r>
+      <w:commentRangeEnd w:id="100"/>
       <w:r>
         <w:rPr>
           <w:rStyle w:val="CommentReference"/>
         </w:rPr>
-        <w:commentReference w:id="90"/>
+        <w:commentReference w:id="100"/>
       </w:r>
     </w:p>
     <w:p>
@@ -8431,7 +8604,7 @@
       <w:r>
         <w:t xml:space="preserve">Prevalence of ASVs plotted as total abundance versus the number of samples </w:t>
       </w:r>
-      <w:ins w:id="93" w:author="Marshall, Andrew" w:date="2025-04-22T16:13:00Z" w16du:dateUtc="2025-04-22T20:13:00Z">
+      <w:ins w:id="103" w:author="Marshall, Andrew" w:date="2025-04-22T16:13:00Z" w16du:dateUtc="2025-04-22T20:13:00Z">
         <w:r>
           <w:t xml:space="preserve">in which </w:t>
         </w:r>
@@ -8439,7 +8612,7 @@
       <w:r>
         <w:t>each ASV appears</w:t>
       </w:r>
-      <w:del w:id="94" w:author="Marshall, Andrew" w:date="2025-04-22T16:13:00Z" w16du:dateUtc="2025-04-22T20:13:00Z">
+      <w:del w:id="104" w:author="Marshall, Andrew" w:date="2025-04-22T16:13:00Z" w16du:dateUtc="2025-04-22T20:13:00Z">
         <w:r>
           <w:delText xml:space="preserve"> in</w:delText>
         </w:r>
@@ -8781,7 +8954,15 @@
         <w:t xml:space="preserve"> </w:t>
       </w:r>
       <w:r>
-        <w:t>with three clusters outlined. The first cluster, highlighted in red, contains the majority of taxa that exhibit a non-linear relationship with temperature.</w:t>
+        <w:t xml:space="preserve">with three clusters outlined. The first cluster, highlighted in red, contains </w:t>
+      </w:r>
+      <w:proofErr w:type="gramStart"/>
+      <w:r>
+        <w:t>the majority of</w:t>
+      </w:r>
+      <w:proofErr w:type="gramEnd"/>
+      <w:r>
+        <w:t xml:space="preserve"> taxa that exhibit a non-linear relationship with temperature.</w:t>
       </w:r>
     </w:p>
     <w:p>
@@ -12889,7 +13070,7 @@
       </w:r>
     </w:p>
   </w:comment>
-  <w:comment w:id="27" w:author="Marshall, Andrew" w:date="2025-04-22T16:20:00Z" w:initials="AM">
+  <w:comment w:id="27" w:author="Lucore, Jordan" w:date="2025-05-16T12:40:00Z" w:initials="JL">
     <w:p>
       <w:r>
         <w:rPr>
@@ -12903,11 +13084,11 @@
           <w:sz w:val="20"/>
           <w:szCs w:val="20"/>
         </w:rPr>
-        <w:t>This seems like a sleight of hand. Are they actually less sensitive, or are the logged numbers just smaller so they look less? I am probably wrong about this, but this kind of thing often raises red flags for me</w:t>
+        <w:t>this is fine now</w:t>
       </w:r>
     </w:p>
   </w:comment>
-  <w:comment w:id="28" w:author="Lucore, Jordan" w:date="2025-04-23T10:39:00Z" w:initials="JL">
+  <w:comment w:id="28" w:author="Marshall, Andrew" w:date="2025-04-22T16:20:00Z" w:initials="AM">
     <w:p>
       <w:r>
         <w:rPr>
@@ -12921,11 +13102,11 @@
           <w:sz w:val="20"/>
           <w:szCs w:val="20"/>
         </w:rPr>
-        <w:t>not sure, I don’t entirely understand the math</w:t>
+        <w:t>This seems like a sleight of hand. Are they actually less sensitive, or are the logged numbers just smaller so they look less? I am probably wrong about this, but this kind of thing often raises red flags for me</w:t>
       </w:r>
     </w:p>
   </w:comment>
-  <w:comment w:id="29" w:author="Marshall, Andrew" w:date="2025-04-22T16:22:00Z" w:initials="AM">
+  <w:comment w:id="29" w:author="Lucore, Jordan" w:date="2025-04-23T10:39:00Z" w:initials="JL">
     <w:p>
       <w:r>
         <w:rPr>
@@ -12939,11 +13120,11 @@
           <w:sz w:val="20"/>
           <w:szCs w:val="20"/>
         </w:rPr>
-        <w:t>I think there needs to be a better justification for this, because this statement is also true if you made it for PC1-PC2 or PC1-PC7, for example. The justification in the caption makes more sense to me– although to my eye it look like it flattens out after 5 or 6, not 4</w:t>
+        <w:t>not sure, I don’t entirely understand the math</w:t>
       </w:r>
     </w:p>
   </w:comment>
-  <w:comment w:id="30" w:author="Lucore, Jordan" w:date="2025-04-23T10:41:00Z" w:initials="JL">
+  <w:comment w:id="30" w:author="Marshall, Andrew" w:date="2025-04-22T16:22:00Z" w:initials="AM">
     <w:p>
       <w:r>
         <w:rPr>
@@ -12957,11 +13138,11 @@
           <w:sz w:val="20"/>
           <w:szCs w:val="20"/>
         </w:rPr>
-        <w:t xml:space="preserve">I see your point, do you think I should just do 1 and 2? or add more? </w:t>
+        <w:t>I think there needs to be a better justification for this, because this statement is also true if you made it for PC1-PC2 or PC1-PC7, for example. The justification in the caption makes more sense to me– although to my eye it look like it flattens out after 5 or 6, not 4</w:t>
       </w:r>
     </w:p>
   </w:comment>
-  <w:comment w:id="31" w:author="Marshall, Andrew" w:date="2025-04-22T16:24:00Z" w:initials="AM">
+  <w:comment w:id="31" w:author="Lucore, Jordan" w:date="2025-04-23T10:41:00Z" w:initials="JL">
     <w:p>
       <w:r>
         <w:rPr>
@@ -12975,11 +13156,11 @@
           <w:sz w:val="20"/>
           <w:szCs w:val="20"/>
         </w:rPr>
-        <w:t>A strong statement! I’m not sure I would put it quite like this</w:t>
+        <w:t xml:space="preserve">I see your point, do you think I should just do 1 and 2? or add more? </w:t>
       </w:r>
     </w:p>
   </w:comment>
-  <w:comment w:id="32" w:author="Lucore, Jordan" w:date="2025-04-23T10:41:00Z" w:initials="JL">
+  <w:comment w:id="32" w:author="Marshall, Andrew" w:date="2025-04-22T16:24:00Z" w:initials="AM">
     <w:p>
       <w:r>
         <w:rPr>
@@ -12993,11 +13174,11 @@
           <w:sz w:val="20"/>
           <w:szCs w:val="20"/>
         </w:rPr>
-        <w:t>thats what you say all the time in class!!!!</w:t>
+        <w:t>A strong statement! I’m not sure I would put it quite like this</w:t>
       </w:r>
     </w:p>
   </w:comment>
-  <w:comment w:id="33" w:author="Marshall, Andrew" w:date="2025-04-22T16:25:00Z" w:initials="AM">
+  <w:comment w:id="33" w:author="Lucore, Jordan" w:date="2025-04-23T10:41:00Z" w:initials="JL">
     <w:p>
       <w:r>
         <w:rPr>
@@ -13011,11 +13192,11 @@
           <w:sz w:val="20"/>
           <w:szCs w:val="20"/>
         </w:rPr>
-        <w:t>reword</w:t>
+        <w:t>thats what you say all the time in class!!!!</w:t>
       </w:r>
     </w:p>
   </w:comment>
-  <w:comment w:id="34" w:author="Lucore, Jordan" w:date="2025-04-23T10:42:00Z" w:initials="JL">
+  <w:comment w:id="34" w:author="Lucore, Jordan" w:date="2025-05-16T12:49:00Z" w:initials="JL">
     <w:p>
       <w:r>
         <w:rPr>
@@ -13029,11 +13210,11 @@
           <w:sz w:val="20"/>
           <w:szCs w:val="20"/>
         </w:rPr>
-        <w:t>whats wrong with this wording</w:t>
+        <w:t xml:space="preserve">the wording is too critical, less confrontational wording </w:t>
       </w:r>
     </w:p>
   </w:comment>
-  <w:comment w:id="40" w:author="Marshall, Andrew" w:date="2025-04-22T16:26:00Z" w:initials="AM">
+  <w:comment w:id="35" w:author="Lucore, Jordan" w:date="2025-05-16T12:50:00Z" w:initials="JL">
     <w:p>
       <w:r>
         <w:rPr>
@@ -13047,11 +13228,11 @@
           <w:sz w:val="20"/>
           <w:szCs w:val="20"/>
         </w:rPr>
-        <w:t>Technically, this is not a zero inflated model. I suggest an alternative description</w:t>
+        <w:t xml:space="preserve">don’t need to make strong claims about that </w:t>
       </w:r>
     </w:p>
   </w:comment>
-  <w:comment w:id="41" w:author="Lucore, Jordan" w:date="2025-04-23T10:43:00Z" w:initials="JL">
+  <w:comment w:id="41" w:author="Marshall, Andrew" w:date="2025-04-22T16:25:00Z" w:initials="AM">
     <w:p>
       <w:r>
         <w:rPr>
@@ -13065,11 +13246,11 @@
           <w:sz w:val="20"/>
           <w:szCs w:val="20"/>
         </w:rPr>
-        <w:t>I’ll just remove it</w:t>
+        <w:t>reword</w:t>
       </w:r>
     </w:p>
   </w:comment>
-  <w:comment w:id="49" w:author="Marshall, Andrew" w:date="2025-04-22T16:28:00Z" w:initials="AM">
+  <w:comment w:id="42" w:author="Lucore, Jordan" w:date="2025-04-23T10:42:00Z" w:initials="JL">
     <w:p>
       <w:r>
         <w:rPr>
@@ -13083,11 +13264,11 @@
           <w:sz w:val="20"/>
           <w:szCs w:val="20"/>
         </w:rPr>
-        <w:t>As you did above, state how this modeled (e.g., random intercept, random slope)</w:t>
+        <w:t>whats wrong with this wording</w:t>
       </w:r>
     </w:p>
   </w:comment>
-  <w:comment w:id="50" w:author="Marshall, Andrew" w:date="2025-04-22T16:29:00Z" w:initials="AM">
+  <w:comment w:id="43" w:author="Lucore, Jordan" w:date="2025-05-16T12:54:00Z" w:initials="JL">
     <w:p>
       <w:r>
         <w:rPr>
@@ -13101,11 +13282,11 @@
           <w:sz w:val="20"/>
           <w:szCs w:val="20"/>
         </w:rPr>
-        <w:t>“taxon” for singular, “taxa” for plural. (cf genus / genera)</w:t>
+        <w:t>grammatical</w:t>
       </w:r>
     </w:p>
   </w:comment>
-  <w:comment w:id="55" w:author="Marshall, Andrew" w:date="2025-04-22T16:46:00Z" w:initials="AM">
+  <w:comment w:id="49" w:author="Marshall, Andrew" w:date="2025-04-22T16:26:00Z" w:initials="AM">
     <w:p>
       <w:r>
         <w:rPr>
@@ -13119,11 +13300,11 @@
           <w:sz w:val="20"/>
           <w:szCs w:val="20"/>
         </w:rPr>
-        <w:t>I did a bunch of comparing GAMs and GLMMs a couple of years ago. I looked back through my code just now and it looks like I convinced myself that this was defensible. But at some point it might be worth us trying to make sure that comparing GAMs and GLMMs is kosher</w:t>
+        <w:t>Technically, this is not a zero inflated model. I suggest an alternative description</w:t>
       </w:r>
     </w:p>
   </w:comment>
-  <w:comment w:id="56" w:author="Lucore, Jordan" w:date="2025-04-23T10:43:00Z" w:initials="JL">
+  <w:comment w:id="50" w:author="Lucore, Jordan" w:date="2025-04-23T10:43:00Z" w:initials="JL">
     <w:p>
       <w:r>
         <w:rPr>
@@ -13137,11 +13318,11 @@
           <w:sz w:val="20"/>
           <w:szCs w:val="20"/>
         </w:rPr>
-        <w:t>Need to talk more about this and what you did in your code</w:t>
+        <w:t>I’ll just remove it</w:t>
       </w:r>
     </w:p>
   </w:comment>
-  <w:comment w:id="57" w:author="Marshall, Andrew" w:date="2025-04-22T16:47:00Z" w:initials="AM">
+  <w:comment w:id="58" w:author="Marshall, Andrew" w:date="2025-04-22T16:28:00Z" w:initials="AM">
     <w:p>
       <w:r>
         <w:rPr>
@@ -13155,11 +13336,11 @@
           <w:sz w:val="20"/>
           <w:szCs w:val="20"/>
         </w:rPr>
-        <w:t>You have a random effect in here, so these are GAMMs</w:t>
+        <w:t>As you did above, state how this modeled (e.g., random intercept, random slope)</w:t>
       </w:r>
     </w:p>
   </w:comment>
-  <w:comment w:id="60" w:author="Marshall, Andrew" w:date="2025-04-22T16:48:00Z" w:initials="AM">
+  <w:comment w:id="59" w:author="Marshall, Andrew" w:date="2025-04-22T16:29:00Z" w:initials="AM">
     <w:p>
       <w:r>
         <w:rPr>
@@ -13173,11 +13354,11 @@
           <w:sz w:val="20"/>
           <w:szCs w:val="20"/>
         </w:rPr>
-        <w:t>might want to call these gamm_main and gamm_full</w:t>
+        <w:t>“taxon” for singular, “taxa” for plural. (cf genus / genera)</w:t>
       </w:r>
     </w:p>
   </w:comment>
-  <w:comment w:id="61" w:author="Marshall, Andrew" w:date="2025-04-22T16:46:00Z" w:initials="AM">
+  <w:comment w:id="64" w:author="Marshall, Andrew" w:date="2025-04-22T16:46:00Z" w:initials="AM">
     <w:p>
       <w:r>
         <w:rPr>
@@ -13195,24 +13376,7 @@
       </w:r>
     </w:p>
   </w:comment>
-  <w:comment w:id="66" w:author="Marshall, Andrew" w:date="2025-04-22T16:53:00Z" w:initials="AM">
-    <w:p>
-      <w:r>
-        <w:rPr>
-          <w:rStyle w:val="CommentReference"/>
-        </w:rPr>
-        <w:annotationRef/>
-      </w:r>
-      <w:r>
-        <w:rPr>
-          <w:sz w:val="20"/>
-          <w:szCs w:val="20"/>
-        </w:rPr>
-        <w:t>Phew, that is a lot of methods, but it is clearly explained and necessary.</w:t>
-      </w:r>
-    </w:p>
-  </w:comment>
-  <w:comment w:id="68" w:author="Lucore, Jordan" w:date="2025-04-07T09:21:00Z" w:initials="JL">
+  <w:comment w:id="65" w:author="Lucore, Jordan" w:date="2025-04-23T10:43:00Z" w:initials="JL">
     <w:p>
       <w:r>
         <w:rPr>
@@ -13226,11 +13390,11 @@
           <w:sz w:val="20"/>
           <w:szCs w:val="20"/>
         </w:rPr>
-        <w:t>Andy: this figure isn’t ready yet</w:t>
+        <w:t>Need to talk more about this and what you did in your code</w:t>
       </w:r>
     </w:p>
   </w:comment>
-  <w:comment w:id="67" w:author="Marshall, Andrew" w:date="2025-04-22T16:56:00Z" w:initials="AM">
+  <w:comment w:id="66" w:author="Marshall, Andrew" w:date="2025-04-22T16:47:00Z" w:initials="AM">
     <w:p>
       <w:r>
         <w:rPr>
@@ -13244,11 +13408,11 @@
           <w:sz w:val="20"/>
           <w:szCs w:val="20"/>
         </w:rPr>
-        <w:t>The verb tense seems a bit odd here</w:t>
+        <w:t>You have a random effect in here, so these are GAMMs</w:t>
       </w:r>
     </w:p>
   </w:comment>
-  <w:comment w:id="69" w:author="Marshall, Andrew" w:date="2025-04-22T16:58:00Z" w:initials="AM">
+  <w:comment w:id="69" w:author="Marshall, Andrew" w:date="2025-04-22T16:48:00Z" w:initials="AM">
     <w:p>
       <w:r>
         <w:rPr>
@@ -13262,11 +13426,11 @@
           <w:sz w:val="20"/>
           <w:szCs w:val="20"/>
         </w:rPr>
-        <w:t>Cool</w:t>
+        <w:t>might want to call these gamm_main and gamm_full</w:t>
       </w:r>
     </w:p>
   </w:comment>
-  <w:comment w:id="70" w:author="Marshall, Andrew" w:date="2025-04-22T16:59:00Z" w:initials="AM">
+  <w:comment w:id="70" w:author="Marshall, Andrew" w:date="2025-04-22T16:46:00Z" w:initials="AM">
     <w:p>
       <w:r>
         <w:rPr>
@@ -13280,11 +13444,28 @@
           <w:sz w:val="20"/>
           <w:szCs w:val="20"/>
         </w:rPr>
-        <w:t>actually, if we used AICc the decisions was based on only on fit, but fit controlling for complexity. O suggest we find a slightly different way to state this</w:t>
+        <w:t>I did a bunch of comparing GAMs and GLMMs a couple of years ago. I looked back through my code just now and it looks like I convinced myself that this was defensible. But at some point it might be worth us trying to make sure that comparing GAMs and GLMMs is kosher</w:t>
       </w:r>
     </w:p>
   </w:comment>
-  <w:comment w:id="71" w:author="Lucore, Jordan" w:date="2025-04-23T10:47:00Z" w:initials="JL">
+  <w:comment w:id="75" w:author="Marshall, Andrew" w:date="2025-04-22T16:53:00Z" w:initials="AM">
+    <w:p>
+      <w:r>
+        <w:rPr>
+          <w:rStyle w:val="CommentReference"/>
+        </w:rPr>
+        <w:annotationRef/>
+      </w:r>
+      <w:r>
+        <w:rPr>
+          <w:sz w:val="20"/>
+          <w:szCs w:val="20"/>
+        </w:rPr>
+        <w:t>Phew, that is a lot of methods, but it is clearly explained and necessary.</w:t>
+      </w:r>
+    </w:p>
+  </w:comment>
+  <w:comment w:id="77" w:author="Lucore, Jordan" w:date="2025-04-07T09:21:00Z" w:initials="JL">
     <w:p>
       <w:r>
         <w:rPr>
@@ -13298,11 +13479,11 @@
           <w:sz w:val="20"/>
           <w:szCs w:val="20"/>
         </w:rPr>
-        <w:t>I need some suggestions</w:t>
+        <w:t>Andy: this figure isn’t ready yet</w:t>
       </w:r>
     </w:p>
   </w:comment>
-  <w:comment w:id="72" w:author="Marshall, Andrew" w:date="2025-04-22T17:01:00Z" w:initials="AM">
+  <w:comment w:id="76" w:author="Marshall, Andrew" w:date="2025-04-22T16:56:00Z" w:initials="AM">
     <w:p>
       <w:r>
         <w:rPr>
@@ -13316,45 +13497,11 @@
           <w:sz w:val="20"/>
           <w:szCs w:val="20"/>
         </w:rPr>
-        <w:t>Nice</w:t>
+        <w:t>The verb tense seems a bit odd here</w:t>
       </w:r>
     </w:p>
   </w:comment>
-  <w:comment w:id="73" w:author="Lucore, Jordan" w:date="2025-04-03T11:00:00Z" w:initials="JL">
-    <w:p>
-      <w:r>
-        <w:rPr>
-          <w:rStyle w:val="CommentReference"/>
-        </w:rPr>
-        <w:annotationRef/>
-      </w:r>
-      <w:r>
-        <w:rPr>
-          <w:sz w:val="20"/>
-          <w:szCs w:val="20"/>
-        </w:rPr>
-        <w:t>Andy: I know this will need to be cut… eventually, but it covers all of the main ideas that I think are important and novel. I’m interested in your first impressions.</w:t>
-      </w:r>
-    </w:p>
-  </w:comment>
-  <w:comment w:id="74" w:author="Marshall, Andrew" w:date="2025-04-22T17:07:00Z" w:initials="AM">
-    <w:p>
-      <w:r>
-        <w:rPr>
-          <w:rStyle w:val="CommentReference"/>
-        </w:rPr>
-        <w:annotationRef/>
-      </w:r>
-      <w:r>
-        <w:rPr>
-          <w:sz w:val="20"/>
-          <w:szCs w:val="20"/>
-        </w:rPr>
-        <w:t>reword, this isn’t quite parallel to the structure of season or habitat disturbance or sociality</w:t>
-      </w:r>
-    </w:p>
-  </w:comment>
-  <w:comment w:id="75" w:author="Lucore, Jordan" w:date="2025-04-07T10:13:00Z" w:initials="JL">
+  <w:comment w:id="78" w:author="Marshall, Andrew" w:date="2025-04-22T16:58:00Z" w:initials="AM">
     <w:p>
       <w:r>
         <w:rPr>
@@ -13368,11 +13515,11 @@
           <w:sz w:val="20"/>
           <w:szCs w:val="20"/>
         </w:rPr>
-        <w:t>probably could cut some of this paragraph</w:t>
+        <w:t>Cool</w:t>
       </w:r>
     </w:p>
   </w:comment>
-  <w:comment w:id="76" w:author="Marshall, Andrew" w:date="2025-04-22T17:09:00Z" w:initials="AM">
+  <w:comment w:id="79" w:author="Marshall, Andrew" w:date="2025-04-22T16:59:00Z" w:initials="AM">
     <w:p>
       <w:r>
         <w:rPr>
@@ -13386,11 +13533,11 @@
           <w:sz w:val="20"/>
           <w:szCs w:val="20"/>
         </w:rPr>
-        <w:t>Yes, I think some tightening could make this more punchy</w:t>
+        <w:t>actually, if we used AICc the decisions was based on only on fit, but fit controlling for complexity. O suggest we find a slightly different way to state this</w:t>
       </w:r>
     </w:p>
   </w:comment>
-  <w:comment w:id="77" w:author="Marshall, Andrew" w:date="2025-04-22T17:10:00Z" w:initials="AM">
+  <w:comment w:id="80" w:author="Lucore, Jordan" w:date="2025-04-23T10:47:00Z" w:initials="JL">
     <w:p>
       <w:r>
         <w:rPr>
@@ -13404,11 +13551,11 @@
           <w:sz w:val="20"/>
           <w:szCs w:val="20"/>
         </w:rPr>
-        <w:t>Nice. This is clear and interesting.</w:t>
+        <w:t>I need some suggestions</w:t>
       </w:r>
     </w:p>
   </w:comment>
-  <w:comment w:id="78" w:author="Marshall, Andrew" w:date="2025-04-22T17:18:00Z" w:initials="AM">
+  <w:comment w:id="81" w:author="Lucore, Jordan" w:date="2025-05-16T12:55:00Z" w:initials="JL">
     <w:p>
       <w:r>
         <w:rPr>
@@ -13422,11 +13569,11 @@
           <w:sz w:val="20"/>
           <w:szCs w:val="20"/>
         </w:rPr>
-        <w:t xml:space="preserve">Cool! </w:t>
+        <w:t>use terminalolgy like “best model” instead of model fit, best is pretty clear</w:t>
       </w:r>
     </w:p>
   </w:comment>
-  <w:comment w:id="79" w:author="Lucore, Jordan" w:date="2025-04-07T12:30:00Z" w:initials="JL">
+  <w:comment w:id="82" w:author="Marshall, Andrew" w:date="2025-04-22T17:01:00Z" w:initials="AM">
     <w:p>
       <w:r>
         <w:rPr>
@@ -13440,11 +13587,45 @@
           <w:sz w:val="20"/>
           <w:szCs w:val="20"/>
         </w:rPr>
-        <w:t>this is a broad idea but I need to do more research on the mechanism</w:t>
+        <w:t>Nice</w:t>
       </w:r>
     </w:p>
   </w:comment>
-  <w:comment w:id="80" w:author="Marshall, Andrew" w:date="2025-04-22T17:19:00Z" w:initials="AM">
+  <w:comment w:id="83" w:author="Lucore, Jordan" w:date="2025-04-03T11:00:00Z" w:initials="JL">
+    <w:p>
+      <w:r>
+        <w:rPr>
+          <w:rStyle w:val="CommentReference"/>
+        </w:rPr>
+        <w:annotationRef/>
+      </w:r>
+      <w:r>
+        <w:rPr>
+          <w:sz w:val="20"/>
+          <w:szCs w:val="20"/>
+        </w:rPr>
+        <w:t>Andy: I know this will need to be cut… eventually, but it covers all of the main ideas that I think are important and novel. I’m interested in your first impressions.</w:t>
+      </w:r>
+    </w:p>
+  </w:comment>
+  <w:comment w:id="84" w:author="Marshall, Andrew" w:date="2025-04-22T17:07:00Z" w:initials="AM">
+    <w:p>
+      <w:r>
+        <w:rPr>
+          <w:rStyle w:val="CommentReference"/>
+        </w:rPr>
+        <w:annotationRef/>
+      </w:r>
+      <w:r>
+        <w:rPr>
+          <w:sz w:val="20"/>
+          <w:szCs w:val="20"/>
+        </w:rPr>
+        <w:t>reword, this isn’t quite parallel to the structure of season or habitat disturbance or sociality</w:t>
+      </w:r>
+    </w:p>
+  </w:comment>
+  <w:comment w:id="85" w:author="Lucore, Jordan" w:date="2025-04-07T10:13:00Z" w:initials="JL">
     <w:p>
       <w:r>
         <w:rPr>
@@ -13458,11 +13639,11 @@
           <w:sz w:val="20"/>
           <w:szCs w:val="20"/>
         </w:rPr>
-        <w:t>Yes, I think a bit more would be helpful here</w:t>
+        <w:t>probably could cut some of this paragraph</w:t>
       </w:r>
     </w:p>
   </w:comment>
-  <w:comment w:id="81" w:author="Marshall, Andrew" w:date="2025-04-22T17:21:00Z" w:initials="AM">
+  <w:comment w:id="86" w:author="Marshall, Andrew" w:date="2025-04-22T17:09:00Z" w:initials="AM">
     <w:p>
       <w:r>
         <w:rPr>
@@ -13476,11 +13657,11 @@
           <w:sz w:val="20"/>
           <w:szCs w:val="20"/>
         </w:rPr>
-        <w:t>Are you making a claim that we think one level of directionality is more likely than the other? I think more justification is needed for that</w:t>
+        <w:t>Yes, I think some tightening could make this more punchy</w:t>
       </w:r>
     </w:p>
   </w:comment>
-  <w:comment w:id="82" w:author="Lucore, Jordan" w:date="2025-04-24T16:51:00Z" w:initials="JL">
+  <w:comment w:id="87" w:author="Marshall, Andrew" w:date="2025-04-22T17:10:00Z" w:initials="AM">
     <w:p>
       <w:r>
         <w:rPr>
@@ -13494,11 +13675,11 @@
           <w:sz w:val="20"/>
           <w:szCs w:val="20"/>
         </w:rPr>
-        <w:t>if we really think this is directional then set it up in the intro, if I find support hten it would justfiy direcitonality in the title</w:t>
+        <w:t>Nice. This is clear and interesting.</w:t>
       </w:r>
     </w:p>
   </w:comment>
-  <w:comment w:id="83" w:author="Lucore, Jordan" w:date="2025-04-24T16:55:00Z" w:initials="JL">
+  <w:comment w:id="88" w:author="Marshall, Andrew" w:date="2025-04-22T17:18:00Z" w:initials="AM">
     <w:p>
       <w:r>
         <w:rPr>
@@ -13512,28 +13693,11 @@
           <w:sz w:val="20"/>
           <w:szCs w:val="20"/>
         </w:rPr>
-        <w:t>do this before sending to katie</w:t>
+        <w:t xml:space="preserve">Cool! </w:t>
       </w:r>
     </w:p>
   </w:comment>
-  <w:comment w:id="84" w:author="Lucore, Jordan" w:date="2025-04-07T11:27:00Z" w:initials="JL">
-    <w:p>
-      <w:r>
-        <w:rPr>
-          <w:rStyle w:val="CommentReference"/>
-        </w:rPr>
-        <w:annotationRef/>
-      </w:r>
-      <w:r>
-        <w:rPr>
-          <w:sz w:val="20"/>
-          <w:szCs w:val="20"/>
-        </w:rPr>
-        <w:t>This paragraph is not as strong as the others and needs to be cleaned up</w:t>
-      </w:r>
-    </w:p>
-  </w:comment>
-  <w:comment w:id="85" w:author="Marshall, Andrew" w:date="2025-04-22T17:21:00Z" w:initials="AM">
+  <w:comment w:id="89" w:author="Lucore, Jordan" w:date="2025-04-07T12:30:00Z" w:initials="JL">
     <w:p>
       <w:r>
         <w:rPr>
@@ -13547,28 +13711,11 @@
           <w:sz w:val="20"/>
           <w:szCs w:val="20"/>
         </w:rPr>
-        <w:t xml:space="preserve">Yes, but I like that we’re making an argument about directionality. </w:t>
+        <w:t>this is a broad idea but I need to do more research on the mechanism</w:t>
       </w:r>
     </w:p>
   </w:comment>
-  <w:comment w:id="86" w:author="Marshall, Andrew" w:date="2025-04-22T17:13:00Z" w:initials="AM">
-    <w:p>
-      <w:r>
-        <w:rPr>
-          <w:rStyle w:val="CommentReference"/>
-        </w:rPr>
-        <w:annotationRef/>
-      </w:r>
-      <w:r>
-        <w:rPr>
-          <w:sz w:val="20"/>
-          <w:szCs w:val="20"/>
-        </w:rPr>
-        <w:t>Great! This is coming along really nicely. To return to the question of title again… I think I will need to re-read this to be sure, but if we can beef up the justification for interpreting the directionality in one of the two possible ways, then adding reference to that directionality in the title seems reasonable to me.</w:t>
-      </w:r>
-    </w:p>
-  </w:comment>
-  <w:comment w:id="87" w:author="Lucore, Jordan" w:date="2025-04-07T12:39:00Z" w:initials="JL">
+  <w:comment w:id="90" w:author="Marshall, Andrew" w:date="2025-04-22T17:19:00Z" w:initials="AM">
     <w:p>
       <w:r>
         <w:rPr>
@@ -13582,11 +13729,11 @@
           <w:sz w:val="20"/>
           <w:szCs w:val="20"/>
         </w:rPr>
-        <w:t>Andy: quick reminder that these figures are not in final form. I have a lot of changes to implement from when you originally gave me feedback, but I’ve been waiting to finish the shotgun analysis.</w:t>
+        <w:t>Yes, I think a bit more would be helpful here</w:t>
       </w:r>
     </w:p>
   </w:comment>
-  <w:comment w:id="88" w:author="Marshall, Andrew" w:date="2025-04-22T17:04:00Z" w:initials="AM">
+  <w:comment w:id="91" w:author="Marshall, Andrew" w:date="2025-04-22T17:21:00Z" w:initials="AM">
     <w:p>
       <w:r>
         <w:rPr>
@@ -13600,11 +13747,11 @@
           <w:sz w:val="20"/>
           <w:szCs w:val="20"/>
         </w:rPr>
-        <w:t xml:space="preserve">Something looks off to me here… the description of the rows doesn’t seem to match what is depicted (if I understand the text correctly) </w:t>
+        <w:t>Are you making a claim that we think one level of directionality is more likely than the other? I think more justification is needed for that</w:t>
       </w:r>
     </w:p>
   </w:comment>
-  <w:comment w:id="89" w:author="Marshall, Andrew" w:date="2025-04-22T17:17:00Z" w:initials="AM">
+  <w:comment w:id="92" w:author="Lucore, Jordan" w:date="2025-04-24T16:51:00Z" w:initials="JL">
     <w:p>
       <w:r>
         <w:rPr>
@@ -13618,11 +13765,135 @@
           <w:sz w:val="20"/>
           <w:szCs w:val="20"/>
         </w:rPr>
+        <w:t>if we really think this is directional then set it up in the intro, if I find support hten it would justfiy direcitonality in the title</w:t>
+      </w:r>
+    </w:p>
+  </w:comment>
+  <w:comment w:id="93" w:author="Lucore, Jordan" w:date="2025-04-24T16:55:00Z" w:initials="JL">
+    <w:p>
+      <w:r>
+        <w:rPr>
+          <w:rStyle w:val="CommentReference"/>
+        </w:rPr>
+        <w:annotationRef/>
+      </w:r>
+      <w:r>
+        <w:rPr>
+          <w:color w:val="000000"/>
+          <w:sz w:val="20"/>
+          <w:szCs w:val="20"/>
+        </w:rPr>
+        <w:t>do this before sending to katie</w:t>
+      </w:r>
+    </w:p>
+  </w:comment>
+  <w:comment w:id="94" w:author="Lucore, Jordan" w:date="2025-04-07T11:27:00Z" w:initials="JL">
+    <w:p>
+      <w:r>
+        <w:rPr>
+          <w:rStyle w:val="CommentReference"/>
+        </w:rPr>
+        <w:annotationRef/>
+      </w:r>
+      <w:r>
+        <w:rPr>
+          <w:sz w:val="20"/>
+          <w:szCs w:val="20"/>
+        </w:rPr>
+        <w:t>This paragraph is not as strong as the others and needs to be cleaned up</w:t>
+      </w:r>
+    </w:p>
+  </w:comment>
+  <w:comment w:id="95" w:author="Marshall, Andrew" w:date="2025-04-22T17:21:00Z" w:initials="AM">
+    <w:p>
+      <w:r>
+        <w:rPr>
+          <w:rStyle w:val="CommentReference"/>
+        </w:rPr>
+        <w:annotationRef/>
+      </w:r>
+      <w:r>
+        <w:rPr>
+          <w:color w:val="000000"/>
+          <w:sz w:val="20"/>
+          <w:szCs w:val="20"/>
+        </w:rPr>
+        <w:t xml:space="preserve">Yes, but I like that we’re making an argument about directionality. </w:t>
+      </w:r>
+    </w:p>
+  </w:comment>
+  <w:comment w:id="96" w:author="Marshall, Andrew" w:date="2025-04-22T17:13:00Z" w:initials="AM">
+    <w:p>
+      <w:r>
+        <w:rPr>
+          <w:rStyle w:val="CommentReference"/>
+        </w:rPr>
+        <w:annotationRef/>
+      </w:r>
+      <w:r>
+        <w:rPr>
+          <w:sz w:val="20"/>
+          <w:szCs w:val="20"/>
+        </w:rPr>
+        <w:t>Great! This is coming along really nicely. To return to the question of title again… I think I will need to re-read this to be sure, but if we can beef up the justification for interpreting the directionality in one of the two possible ways, then adding reference to that directionality in the title seems reasonable to me.</w:t>
+      </w:r>
+    </w:p>
+  </w:comment>
+  <w:comment w:id="97" w:author="Lucore, Jordan" w:date="2025-04-07T12:39:00Z" w:initials="JL">
+    <w:p>
+      <w:r>
+        <w:rPr>
+          <w:rStyle w:val="CommentReference"/>
+        </w:rPr>
+        <w:annotationRef/>
+      </w:r>
+      <w:r>
+        <w:rPr>
+          <w:color w:val="000000"/>
+          <w:sz w:val="20"/>
+          <w:szCs w:val="20"/>
+        </w:rPr>
+        <w:t>Andy: quick reminder that these figures are not in final form. I have a lot of changes to implement from when you originally gave me feedback, but I’ve been waiting to finish the shotgun analysis.</w:t>
+      </w:r>
+    </w:p>
+  </w:comment>
+  <w:comment w:id="98" w:author="Marshall, Andrew" w:date="2025-04-22T17:04:00Z" w:initials="AM">
+    <w:p>
+      <w:r>
+        <w:rPr>
+          <w:rStyle w:val="CommentReference"/>
+        </w:rPr>
+        <w:annotationRef/>
+      </w:r>
+      <w:r>
+        <w:rPr>
+          <w:color w:val="000000"/>
+          <w:sz w:val="20"/>
+          <w:szCs w:val="20"/>
+        </w:rPr>
+        <w:t xml:space="preserve">Something looks off to me here… the description of the rows doesn’t seem to match what is depicted (if I understand the text correctly) </w:t>
+      </w:r>
+    </w:p>
+  </w:comment>
+  <w:comment w:id="99" w:author="Marshall, Andrew" w:date="2025-04-22T17:17:00Z" w:initials="AM">
+    <w:p>
+      <w:r>
+        <w:rPr>
+          <w:rStyle w:val="CommentReference"/>
+        </w:rPr>
+        <w:annotationRef/>
+      </w:r>
+      <w:r>
+        <w:rPr>
+          <w:color w:val="000000"/>
+          <w:sz w:val="20"/>
+          <w:szCs w:val="20"/>
+        </w:rPr>
         <w:t>To me, the  bottom row, C, is the one depicting the negative applying effect, row A is the positive amplifying effect, and B is the reverse effect– am I missing something?</w:t>
       </w:r>
     </w:p>
   </w:comment>
-  <w:comment w:id="90" w:author="Lucore, Jordan" w:date="2025-04-23T10:49:00Z" w:initials="JL">
+  <w:comment w:id="100" w:author="Lucore, Jordan" w:date="2025-04-23T10:49:00Z" w:initials="JL">
     <w:p>
       <w:r>
         <w:rPr>
@@ -13668,14 +13939,18 @@
   <w15:commentEx w15:paraId="450AB9B4" w15:done="0"/>
   <w15:commentEx w15:paraId="03AB2D70" w15:done="0"/>
   <w15:commentEx w15:paraId="73232C96" w15:paraIdParent="03AB2D70" w15:done="0"/>
+  <w15:commentEx w15:paraId="508DA632" w15:paraIdParent="03AB2D70" w15:done="0"/>
   <w15:commentEx w15:paraId="4BAA8324" w15:done="0"/>
   <w15:commentEx w15:paraId="5EFA6F75" w15:paraIdParent="4BAA8324" w15:done="0"/>
   <w15:commentEx w15:paraId="7EEA9B30" w15:done="0"/>
   <w15:commentEx w15:paraId="2CA5744C" w15:paraIdParent="7EEA9B30" w15:done="0"/>
   <w15:commentEx w15:paraId="73C582CF" w15:done="0"/>
   <w15:commentEx w15:paraId="14BDDF0A" w15:paraIdParent="73C582CF" w15:done="0"/>
+  <w15:commentEx w15:paraId="0CFF3B43" w15:paraIdParent="73C582CF" w15:done="0"/>
+  <w15:commentEx w15:paraId="143268B1" w15:paraIdParent="73C582CF" w15:done="0"/>
   <w15:commentEx w15:paraId="1B298590" w15:done="0"/>
   <w15:commentEx w15:paraId="4DD2CF68" w15:paraIdParent="1B298590" w15:done="0"/>
+  <w15:commentEx w15:paraId="40B3F5A4" w15:paraIdParent="1B298590" w15:done="0"/>
   <w15:commentEx w15:paraId="316701EA" w15:done="0"/>
   <w15:commentEx w15:paraId="4A4E0CC5" w15:paraIdParent="316701EA" w15:done="0"/>
   <w15:commentEx w15:paraId="3B52E788" w15:done="0"/>
@@ -13691,6 +13966,7 @@
   <w15:commentEx w15:paraId="7AFC1363" w15:done="0"/>
   <w15:commentEx w15:paraId="266F6B07" w15:done="0"/>
   <w15:commentEx w15:paraId="200D72DF" w15:paraIdParent="266F6B07" w15:done="0"/>
+  <w15:commentEx w15:paraId="7DB822A3" w15:paraIdParent="266F6B07" w15:done="0"/>
   <w15:commentEx w15:paraId="0E2A6B22" w15:done="0"/>
   <w15:commentEx w15:paraId="61104B4F" w15:done="0"/>
   <w15:commentEx w15:paraId="08F98E67" w15:done="0"/>
@@ -13738,14 +14014,18 @@
   <w16cex:commentExtensible w16cex:durableId="6BBFD4AC" w16cex:dateUtc="2025-04-22T20:17:00Z"/>
   <w16cex:commentExtensible w16cex:durableId="07293F4C" w16cex:dateUtc="2025-04-22T20:18:00Z"/>
   <w16cex:commentExtensible w16cex:durableId="2E8069FC" w16cex:dateUtc="2025-04-23T14:38:00Z"/>
+  <w16cex:commentExtensible w16cex:durableId="3AD8C3D2" w16cex:dateUtc="2025-05-16T16:40:00Z"/>
   <w16cex:commentExtensible w16cex:durableId="350E320D" w16cex:dateUtc="2025-04-22T20:20:00Z"/>
   <w16cex:commentExtensible w16cex:durableId="366C6834" w16cex:dateUtc="2025-04-23T14:39:00Z"/>
   <w16cex:commentExtensible w16cex:durableId="290C7B08" w16cex:dateUtc="2025-04-22T20:22:00Z"/>
   <w16cex:commentExtensible w16cex:durableId="288BD785" w16cex:dateUtc="2025-04-23T14:41:00Z"/>
   <w16cex:commentExtensible w16cex:durableId="7C12D4F3" w16cex:dateUtc="2025-04-22T20:24:00Z"/>
   <w16cex:commentExtensible w16cex:durableId="270B4976" w16cex:dateUtc="2025-04-23T14:41:00Z"/>
+  <w16cex:commentExtensible w16cex:durableId="3F91603C" w16cex:dateUtc="2025-05-16T16:49:00Z"/>
+  <w16cex:commentExtensible w16cex:durableId="2B08306F" w16cex:dateUtc="2025-05-16T16:50:00Z"/>
   <w16cex:commentExtensible w16cex:durableId="27F12724" w16cex:dateUtc="2025-04-22T20:25:00Z"/>
   <w16cex:commentExtensible w16cex:durableId="2C0CFA7D" w16cex:dateUtc="2025-04-23T14:42:00Z"/>
+  <w16cex:commentExtensible w16cex:durableId="2F5C8A90" w16cex:dateUtc="2025-05-16T16:54:00Z"/>
   <w16cex:commentExtensible w16cex:durableId="3F01B0B0" w16cex:dateUtc="2025-04-22T20:26:00Z"/>
   <w16cex:commentExtensible w16cex:durableId="01B9CDBC" w16cex:dateUtc="2025-04-23T14:43:00Z"/>
   <w16cex:commentExtensible w16cex:durableId="29876A41" w16cex:dateUtc="2025-04-22T20:28:00Z"/>
@@ -13761,6 +14041,7 @@
   <w16cex:commentExtensible w16cex:durableId="2E50824E" w16cex:dateUtc="2025-04-22T20:58:00Z"/>
   <w16cex:commentExtensible w16cex:durableId="0D9DB6DA" w16cex:dateUtc="2025-04-22T20:59:00Z"/>
   <w16cex:commentExtensible w16cex:durableId="79001F28" w16cex:dateUtc="2025-04-23T14:47:00Z"/>
+  <w16cex:commentExtensible w16cex:durableId="023C19B0" w16cex:dateUtc="2025-05-16T16:55:00Z"/>
   <w16cex:commentExtensible w16cex:durableId="620B5D9F" w16cex:dateUtc="2025-04-22T21:01:00Z"/>
   <w16cex:commentExtensible w16cex:durableId="02FE3AC1" w16cex:dateUtc="2025-04-03T15:00:00Z"/>
   <w16cex:commentExtensible w16cex:durableId="271B53B2" w16cex:dateUtc="2025-04-22T21:07:00Z"/>
@@ -13808,14 +14089,18 @@
   <w16cid:commentId w16cid:paraId="450AB9B4" w16cid:durableId="6BBFD4AC"/>
   <w16cid:commentId w16cid:paraId="03AB2D70" w16cid:durableId="07293F4C"/>
   <w16cid:commentId w16cid:paraId="73232C96" w16cid:durableId="2E8069FC"/>
+  <w16cid:commentId w16cid:paraId="508DA632" w16cid:durableId="3AD8C3D2"/>
   <w16cid:commentId w16cid:paraId="4BAA8324" w16cid:durableId="350E320D"/>
   <w16cid:commentId w16cid:paraId="5EFA6F75" w16cid:durableId="366C6834"/>
   <w16cid:commentId w16cid:paraId="7EEA9B30" w16cid:durableId="290C7B08"/>
   <w16cid:commentId w16cid:paraId="2CA5744C" w16cid:durableId="288BD785"/>
   <w16cid:commentId w16cid:paraId="73C582CF" w16cid:durableId="7C12D4F3"/>
   <w16cid:commentId w16cid:paraId="14BDDF0A" w16cid:durableId="270B4976"/>
+  <w16cid:commentId w16cid:paraId="0CFF3B43" w16cid:durableId="3F91603C"/>
+  <w16cid:commentId w16cid:paraId="143268B1" w16cid:durableId="2B08306F"/>
   <w16cid:commentId w16cid:paraId="1B298590" w16cid:durableId="27F12724"/>
   <w16cid:commentId w16cid:paraId="4DD2CF68" w16cid:durableId="2C0CFA7D"/>
+  <w16cid:commentId w16cid:paraId="40B3F5A4" w16cid:durableId="2F5C8A90"/>
   <w16cid:commentId w16cid:paraId="316701EA" w16cid:durableId="3F01B0B0"/>
   <w16cid:commentId w16cid:paraId="4A4E0CC5" w16cid:durableId="01B9CDBC"/>
   <w16cid:commentId w16cid:paraId="3B52E788" w16cid:durableId="29876A41"/>
@@ -13831,6 +14116,7 @@
   <w16cid:commentId w16cid:paraId="7AFC1363" w16cid:durableId="2E50824E"/>
   <w16cid:commentId w16cid:paraId="266F6B07" w16cid:durableId="0D9DB6DA"/>
   <w16cid:commentId w16cid:paraId="200D72DF" w16cid:durableId="79001F28"/>
+  <w16cid:commentId w16cid:paraId="7DB822A3" w16cid:durableId="023C19B0"/>
   <w16cid:commentId w16cid:paraId="0E2A6B22" w16cid:durableId="620B5D9F"/>
   <w16cid:commentId w16cid:paraId="61104B4F" w16cid:durableId="02FE3AC1"/>
   <w16cid:commentId w16cid:paraId="08F98E67" w16cid:durableId="271B53B2"/>

</xml_diff>